<commit_message>
Matriz de contenido de septiembre: clasificar 15 piezas sin eje y regenerar el Word
Las 15 piezas sin eje (agosto y meses previos) impedían calcular bien el
porcentaje de nucleo del diagnostico. Se clasificaron con OBRA/NUCLEO-IA/
NUCLEO-BIM/PROMO/COMUNIDAD segun el tema real de cada una, incluyendo los
posts de agosto (DM149, DM150, DM152). Se corrigio ademas la nota del
calendario que citaba 27 comentarios en la pieza mas comentada de agosto
cuando en realidad son 43. Se regenero el docx con los datos ya correctos.
</commit_message>
<xml_diff>
--- a/matriz-viral/entregables/Matriz-Contenido-Septiembre-2026-DMA.docx
+++ b/matriz-viral/entregables/Matriz-Contenido-Septiembre-2026-DMA.docx
@@ -67,7 +67,7 @@
           <w:sz w:val="21"/>
           <w:szCs w:val="21"/>
         </w:rPr>
-        <w:t xml:space="preserve">Todo está construido sobre datos reales: la matriz viral de la cuenta (151 piezas analizadas, al 2026-08-16) y el rendimiento real de las campañas.</w:t>
+        <w:t xml:space="preserve">Todo está construido sobre datos reales: la matriz viral de la cuenta (152 piezas analizadas, al 2026-08-19) y el rendimiento real de las campañas.</w:t>
       </w:r>
     </w:p>
     <w:p>
@@ -567,7 +567,7 @@
           <w:sz w:val="21"/>
           <w:szCs w:val="21"/>
         </w:rPr>
-        <w:t xml:space="preserve">Cuenta publicitaria, ventana 2026-07-17 → 2026-08-15: $959.34 invertidos · 1231 leads · CPL promedio $0.78.</w:t>
+        <w:t xml:space="preserve">Cuenta publicitaria, ventana 2026-07-20 → 2026-08-18: $1067.56 invertidos · 1361 leads · CPL promedio $0.78.</w:t>
       </w:r>
     </w:p>
     <w:tbl>
@@ -709,7 +709,7 @@
                 <w:sz w:val="18"/>
                 <w:szCs w:val="18"/>
               </w:rPr>
-              <w:t xml:space="preserve">$475.43</w:t>
+              <w:t xml:space="preserve">$507.46</w:t>
             </w:r>
           </w:p>
         </w:tc>
@@ -723,7 +723,7 @@
                 <w:sz w:val="18"/>
                 <w:szCs w:val="18"/>
               </w:rPr>
-              <w:t xml:space="preserve">783</w:t>
+              <w:t xml:space="preserve">785</w:t>
             </w:r>
           </w:p>
         </w:tc>
@@ -751,7 +751,7 @@
                 <w:sz w:val="18"/>
                 <w:szCs w:val="18"/>
               </w:rPr>
-              <w:t xml:space="preserve">$0.61</w:t>
+              <w:t xml:space="preserve">$0.65</w:t>
             </w:r>
           </w:p>
         </w:tc>
@@ -781,7 +781,7 @@
                 <w:sz w:val="18"/>
                 <w:szCs w:val="18"/>
               </w:rPr>
-              <w:t xml:space="preserve">$267.39</w:t>
+              <w:t xml:space="preserve">$272.43</w:t>
             </w:r>
           </w:p>
         </w:tc>
@@ -795,7 +795,7 @@
                 <w:sz w:val="18"/>
                 <w:szCs w:val="18"/>
               </w:rPr>
-              <w:t xml:space="preserve">226</w:t>
+              <w:t xml:space="preserve">209</w:t>
             </w:r>
           </w:p>
         </w:tc>
@@ -823,7 +823,7 @@
                 <w:sz w:val="18"/>
                 <w:szCs w:val="18"/>
               </w:rPr>
-              <w:t xml:space="preserve">$1.18</w:t>
+              <w:t xml:space="preserve">$1.30</w:t>
             </w:r>
           </w:p>
         </w:tc>
@@ -839,6 +839,78 @@
                 <w:sz w:val="18"/>
                 <w:szCs w:val="18"/>
               </w:rPr>
+              <w:t xml:space="preserve">🟡 [AGOSTO] ESPE.1 ACERO - FORM (geo-split)</w:t>
+            </w:r>
+          </w:p>
+        </w:tc>
+        <w:tc>
+          <w:tcPr>
+            <w:tcW w:type="dxa" w:w="1300"/>
+          </w:tcPr>
+          <w:p>
+            <w:r>
+              <w:rPr>
+                <w:sz w:val="18"/>
+                <w:szCs w:val="18"/>
+              </w:rPr>
+              <w:t xml:space="preserve">$128.08</w:t>
+            </w:r>
+          </w:p>
+        </w:tc>
+        <w:tc>
+          <w:tcPr>
+            <w:tcW w:type="dxa" w:w="1100"/>
+          </w:tcPr>
+          <w:p>
+            <w:r>
+              <w:rPr>
+                <w:sz w:val="18"/>
+                <w:szCs w:val="18"/>
+              </w:rPr>
+              <w:t xml:space="preserve">254</w:t>
+            </w:r>
+          </w:p>
+        </w:tc>
+        <w:tc>
+          <w:tcPr>
+            <w:tcW w:type="dxa" w:w="1600"/>
+          </w:tcPr>
+          <w:p>
+            <w:r>
+              <w:rPr>
+                <w:sz w:val="18"/>
+                <w:szCs w:val="18"/>
+              </w:rPr>
+              <w:t xml:space="preserve">Formulario</w:t>
+            </w:r>
+          </w:p>
+        </w:tc>
+        <w:tc>
+          <w:tcPr>
+            <w:tcW w:type="dxa" w:w="1000"/>
+          </w:tcPr>
+          <w:p>
+            <w:r>
+              <w:rPr>
+                <w:sz w:val="18"/>
+                <w:szCs w:val="18"/>
+              </w:rPr>
+              <w:t xml:space="preserve">$0.50</w:t>
+            </w:r>
+          </w:p>
+        </w:tc>
+      </w:tr>
+      <w:tr>
+        <w:tc>
+          <w:tcPr>
+            <w:tcW w:type="dxa" w:w="4200"/>
+          </w:tcPr>
+          <w:p>
+            <w:r>
+              <w:rPr>
+                <w:sz w:val="18"/>
+                <w:szCs w:val="18"/>
+              </w:rPr>
               <w:t xml:space="preserve">🟢[12MAYO] TRÁFICO AL PERFIL - IG</w:t>
             </w:r>
           </w:p>
@@ -853,7 +925,7 @@
                 <w:sz w:val="18"/>
                 <w:szCs w:val="18"/>
               </w:rPr>
-              <w:t xml:space="preserve">$81.52</w:t>
+              <w:t xml:space="preserve">$80.80</w:t>
             </w:r>
           </w:p>
         </w:tc>
@@ -925,7 +997,7 @@
                 <w:sz w:val="18"/>
                 <w:szCs w:val="18"/>
               </w:rPr>
-              <w:t xml:space="preserve">$72.85</w:t>
+              <w:t xml:space="preserve">$78.79</w:t>
             </w:r>
           </w:p>
         </w:tc>
@@ -939,7 +1011,7 @@
                 <w:sz w:val="18"/>
                 <w:szCs w:val="18"/>
               </w:rPr>
-              <w:t xml:space="preserve">128</w:t>
+              <w:t xml:space="preserve">113</w:t>
             </w:r>
           </w:p>
         </w:tc>
@@ -967,79 +1039,7 @@
                 <w:sz w:val="18"/>
                 <w:szCs w:val="18"/>
               </w:rPr>
-              <w:t xml:space="preserve">$0.57</w:t>
-            </w:r>
-          </w:p>
-        </w:tc>
-      </w:tr>
-      <w:tr>
-        <w:tc>
-          <w:tcPr>
-            <w:tcW w:type="dxa" w:w="4200"/>
-          </w:tcPr>
-          <w:p>
-            <w:r>
-              <w:rPr>
-                <w:sz w:val="18"/>
-                <w:szCs w:val="18"/>
-              </w:rPr>
-              <w:t xml:space="preserve">🟡 [AGOSTO] ESPE.1 ACERO - FORM (geo-split)</w:t>
-            </w:r>
-          </w:p>
-        </w:tc>
-        <w:tc>
-          <w:tcPr>
-            <w:tcW w:type="dxa" w:w="1300"/>
-          </w:tcPr>
-          <w:p>
-            <w:r>
-              <w:rPr>
-                <w:sz w:val="18"/>
-                <w:szCs w:val="18"/>
-              </w:rPr>
-              <w:t xml:space="preserve">$62.15</w:t>
-            </w:r>
-          </w:p>
-        </w:tc>
-        <w:tc>
-          <w:tcPr>
-            <w:tcW w:type="dxa" w:w="1100"/>
-          </w:tcPr>
-          <w:p>
-            <w:r>
-              <w:rPr>
-                <w:sz w:val="18"/>
-                <w:szCs w:val="18"/>
-              </w:rPr>
-              <w:t xml:space="preserve">93</w:t>
-            </w:r>
-          </w:p>
-        </w:tc>
-        <w:tc>
-          <w:tcPr>
-            <w:tcW w:type="dxa" w:w="1600"/>
-          </w:tcPr>
-          <w:p>
-            <w:r>
-              <w:rPr>
-                <w:sz w:val="18"/>
-                <w:szCs w:val="18"/>
-              </w:rPr>
-              <w:t xml:space="preserve">Formulario</w:t>
-            </w:r>
-          </w:p>
-        </w:tc>
-        <w:tc>
-          <w:tcPr>
-            <w:tcW w:type="dxa" w:w="1000"/>
-          </w:tcPr>
-          <w:p>
-            <w:r>
-              <w:rPr>
-                <w:sz w:val="18"/>
-                <w:szCs w:val="18"/>
-              </w:rPr>
-              <w:t xml:space="preserve">$0.67</w:t>
+              <w:t xml:space="preserve">$0.70</w:t>
             </w:r>
           </w:p>
         </w:tc>
@@ -1061,7 +1061,7 @@
           <w:sz w:val="20"/>
           <w:szCs w:val="20"/>
         </w:rPr>
-        <w:t xml:space="preserve">⚠️ 1 campaña(s) gastaron $81.52 sin un solo lead: 🟢[12MAYO] TRÁFICO AL PERFIL - IG. Un CTR alto sin conversión no es una buena campaña.</w:t>
+        <w:t xml:space="preserve">⚠️ 1 campaña(s) gastaron $80.80 sin un solo lead: 🟢[12MAYO] TRÁFICO AL PERFIL - IG. Un CTR alto sin conversión no es una buena campaña.</w:t>
       </w:r>
     </w:p>
     <w:p>
@@ -1080,7 +1080,7 @@
           <w:sz w:val="20"/>
           <w:szCs w:val="20"/>
         </w:rPr>
-        <w:t xml:space="preserve">2 campaña(s) sin gasto en la ventana: están pausadas o sin entregar. No se listan.</w:t>
+        <w:t xml:space="preserve">1 campaña(s) sin gasto en la ventana: están pausadas o sin entregar. No se listan.</w:t>
       </w:r>
     </w:p>
     <w:p>
@@ -1107,7 +1107,7 @@
           <w:sz w:val="21"/>
           <w:szCs w:val="21"/>
         </w:rPr>
-        <w:t xml:space="preserve">Cobrado en el periodo: $10.767,91. Por cada dólar de pauta volvieron $11.22.</w:t>
+        <w:t xml:space="preserve">Cobrado en el periodo: $10.987,91. Por cada dólar de pauta volvieron $10.29.</w:t>
       </w:r>
     </w:p>
     <w:p>
@@ -1157,7 +1157,7 @@
           <w:sz w:val="21"/>
           <w:szCs w:val="21"/>
         </w:rPr>
-        <w:t xml:space="preserve">151 piezas analizadas · 13.210.187 vistas · mediana 5246 · refrescado el 2026-08-16.</w:t>
+        <w:t xml:space="preserve">152 piezas analizadas · 13.215.621 vistas · mediana 5246 · refrescado el 2026-08-19.</w:t>
       </w:r>
     </w:p>
     <w:tbl>
@@ -1280,7 +1280,7 @@
                 <w:sz w:val="18"/>
                 <w:szCs w:val="18"/>
               </w:rPr>
-              <w:t xml:space="preserve">78</w:t>
+              <w:t xml:space="preserve">83</w:t>
             </w:r>
           </w:p>
         </w:tc>
@@ -1294,7 +1294,7 @@
                 <w:sz w:val="18"/>
                 <w:szCs w:val="18"/>
               </w:rPr>
-              <w:t xml:space="preserve">52%</w:t>
+              <w:t xml:space="preserve">55%</w:t>
             </w:r>
           </w:p>
         </w:tc>
@@ -1308,7 +1308,7 @@
                 <w:sz w:val="18"/>
                 <w:szCs w:val="18"/>
               </w:rPr>
-              <w:t xml:space="preserve">98.1%</w:t>
+              <w:t xml:space="preserve">98.3%</w:t>
             </w:r>
           </w:p>
         </w:tc>
@@ -1338,7 +1338,7 @@
                 <w:sz w:val="18"/>
                 <w:szCs w:val="18"/>
               </w:rPr>
-              <w:t xml:space="preserve">29</w:t>
+              <w:t xml:space="preserve">34</w:t>
             </w:r>
           </w:p>
         </w:tc>
@@ -1352,7 +1352,7 @@
                 <w:sz w:val="18"/>
                 <w:szCs w:val="18"/>
               </w:rPr>
-              <w:t xml:space="preserve">19%</w:t>
+              <w:t xml:space="preserve">22%</w:t>
             </w:r>
           </w:p>
         </w:tc>
@@ -1366,7 +1366,7 @@
                 <w:sz w:val="18"/>
                 <w:szCs w:val="18"/>
               </w:rPr>
-              <w:t xml:space="preserve">0.7%</w:t>
+              <w:t xml:space="preserve">0.8%</w:t>
             </w:r>
           </w:p>
         </w:tc>
@@ -1396,7 +1396,7 @@
                 <w:sz w:val="18"/>
                 <w:szCs w:val="18"/>
               </w:rPr>
-              <w:t xml:space="preserve">21</w:t>
+              <w:t xml:space="preserve">22</w:t>
             </w:r>
           </w:p>
         </w:tc>
@@ -1440,7 +1440,7 @@
                 <w:sz w:val="18"/>
                 <w:szCs w:val="18"/>
               </w:rPr>
-              <w:t xml:space="preserve">sin clasificar</w:t>
+              <w:t xml:space="preserve">PROMO</w:t>
             </w:r>
           </w:p>
         </w:tc>
@@ -1454,7 +1454,7 @@
                 <w:sz w:val="18"/>
                 <w:szCs w:val="18"/>
               </w:rPr>
-              <w:t xml:space="preserve">14</w:t>
+              <w:t xml:space="preserve">9</w:t>
             </w:r>
           </w:p>
         </w:tc>
@@ -1468,7 +1468,7 @@
                 <w:sz w:val="18"/>
                 <w:szCs w:val="18"/>
               </w:rPr>
-              <w:t xml:space="preserve">9%</w:t>
+              <w:t xml:space="preserve">6%</w:t>
             </w:r>
           </w:p>
         </w:tc>
@@ -1482,7 +1482,7 @@
                 <w:sz w:val="18"/>
                 <w:szCs w:val="18"/>
               </w:rPr>
-              <w:t xml:space="preserve">0.4%</w:t>
+              <w:t xml:space="preserve">0.2%</w:t>
             </w:r>
           </w:p>
         </w:tc>
@@ -1498,7 +1498,7 @@
                 <w:sz w:val="18"/>
                 <w:szCs w:val="18"/>
               </w:rPr>
-              <w:t xml:space="preserve">PROMO</w:t>
+              <w:t xml:space="preserve">COMUNIDAD</w:t>
             </w:r>
           </w:p>
         </w:tc>
@@ -1512,7 +1512,7 @@
                 <w:sz w:val="18"/>
                 <w:szCs w:val="18"/>
               </w:rPr>
-              <w:t xml:space="preserve">7</w:t>
+              <w:t xml:space="preserve">4</w:t>
             </w:r>
           </w:p>
         </w:tc>
@@ -1526,65 +1526,7 @@
                 <w:sz w:val="18"/>
                 <w:szCs w:val="18"/>
               </w:rPr>
-              <w:t xml:space="preserve">5%</w:t>
-            </w:r>
-          </w:p>
-        </w:tc>
-        <w:tc>
-          <w:tcPr>
-            <w:tcW w:type="dxa" w:w="2500"/>
-          </w:tcPr>
-          <w:p>
-            <w:r>
-              <w:rPr>
-                <w:sz w:val="18"/>
-                <w:szCs w:val="18"/>
-              </w:rPr>
-              <w:t xml:space="preserve">0.2%</w:t>
-            </w:r>
-          </w:p>
-        </w:tc>
-      </w:tr>
-      <w:tr>
-        <w:tc>
-          <w:tcPr>
-            <w:tcW w:type="dxa" w:w="3600"/>
-          </w:tcPr>
-          <w:p>
-            <w:r>
-              <w:rPr>
-                <w:sz w:val="18"/>
-                <w:szCs w:val="18"/>
-              </w:rPr>
-              <w:t xml:space="preserve">COMUNIDAD</w:t>
-            </w:r>
-          </w:p>
-        </w:tc>
-        <w:tc>
-          <w:tcPr>
-            <w:tcW w:type="dxa" w:w="1300"/>
-          </w:tcPr>
-          <w:p>
-            <w:r>
-              <w:rPr>
-                <w:sz w:val="18"/>
-                <w:szCs w:val="18"/>
-              </w:rPr>
-              <w:t xml:space="preserve">2</w:t>
-            </w:r>
-          </w:p>
-        </w:tc>
-        <w:tc>
-          <w:tcPr>
-            <w:tcW w:type="dxa" w:w="1800"/>
-          </w:tcPr>
-          <w:p>
-            <w:r>
-              <w:rPr>
-                <w:sz w:val="18"/>
-                <w:szCs w:val="18"/>
-              </w:rPr>
-              <w:t xml:space="preserve">1%</w:t>
+              <w:t xml:space="preserve">3%</w:t>
             </w:r>
           </w:p>
         </w:tc>
@@ -1620,7 +1562,7 @@
           <w:sz w:val="20"/>
           <w:szCs w:val="20"/>
         </w:rPr>
-        <w:t xml:space="preserve">OBRA se lleva el 98.1% del alcance con el 52% de las piezas — y trae publico que mira pero no compra. El formato viral funciona; el tema es el que hay que mover al nucleo BIM+IA.</w:t>
+        <w:t xml:space="preserve">OBRA se lleva el 98.3% del alcance con el 55% de las piezas — y trae publico que mira pero no compra. El formato viral funciona; el tema es el que hay que mover al nucleo BIM+IA.</w:t>
       </w:r>
     </w:p>
     <w:p>
@@ -2102,25 +2044,6 @@
         </w:tc>
       </w:tr>
     </w:tbl>
-    <w:p>
-      <w:pPr>
-        <w:pBdr>
-          <w:left w:val="single" w:color="C96A1C" w:sz="18" w:space="8"/>
-        </w:pBdr>
-        <w:shd w:fill="F4F7FA" w:val="clear"/>
-        <w:spacing w:after="100"/>
-      </w:pPr>
-      <w:r>
-        <w:rPr>
-          <w:i/>
-          <w:iCs/>
-          <w:color w:val="5A6B7B"/>
-          <w:sz w:val="20"/>
-          <w:szCs w:val="20"/>
-        </w:rPr>
-        <w:t xml:space="preserve">14 pieza(s) estan sin clasificar por eje. Hasta que se les ponga, no cuentan en el diagnostico de arriba.</w:t>
-      </w:r>
-    </w:p>
     <w:p>
       <w:r>
         <w:br w:type="page"/>
@@ -5745,7 +5668,7 @@
           <w:sz w:val="20"/>
           <w:szCs w:val="20"/>
         </w:rPr>
-        <w:t xml:space="preserve">La pieza mas comentada de agosto (27 comentarios). Se repite el angulo, no el texto.</w:t>
+        <w:t xml:space="preserve">La pieza mas comentada de agosto (43 comentarios). Se repite el angulo, no el texto.</w:t>
       </w:r>
     </w:p>
     <w:p>

</xml_diff>

<commit_message>
El reel #5 es el Valor 6 ya editado: sube el Mie 9 y su slot extra desaparece
Confirmado por Dayana. Quedan 5 extras (Mar 8, Sab 12, Sab 19, Mar 22, Sab 26)
y el checklist pierde la tarea de confirmarlo.

Co-Authored-By: Claude Fable 5 <noreply@anthropic.com>
Claude-Session: https://claude.ai/code/session_01KESLfcCy2ne1PvhuvNrN6q
</commit_message>
<xml_diff>
--- a/matriz-viral/entregables/Matriz-Contenido-Septiembre-2026-DMA.docx
+++ b/matriz-viral/entregables/Matriz-Contenido-Septiembre-2026-DMA.docx
@@ -417,7 +417,7 @@
                 <w:sz w:val="18"/>
                 <w:szCs w:val="18"/>
               </w:rPr>
-              <w:t xml:space="preserve">Confirmar si el reel grabado #5 (ChatGPT + Revit) es el mismo «Valor 6» ya editado</w:t>
+              <w:t xml:space="preserve">Confirmar la palabra clave del reel Valor 6 (¿GUIA?) y montar su disparador</w:t>
             </w:r>
           </w:p>
         </w:tc>
@@ -431,7 +431,7 @@
                 <w:sz w:val="18"/>
                 <w:szCs w:val="18"/>
               </w:rPr>
-              <w:t xml:space="preserve">evita publicar el mismo video dos veces (Mi 9 y Mar 15)</w:t>
+              <w:t xml:space="preserve">Reel del Mi 9</w:t>
             </w:r>
           </w:p>
         </w:tc>
@@ -475,7 +475,7 @@
                 <w:sz w:val="18"/>
                 <w:szCs w:val="18"/>
               </w:rPr>
-              <w:t xml:space="preserve">Confirmar la palabra clave del reel Valor 6 (¿GUIA?) y montar su disparador</w:t>
+              <w:t xml:space="preserve">Crear lead magnet: Guia «Revit + ChatGPT: resuelve errores con IA»</w:t>
             </w:r>
           </w:p>
         </w:tc>
@@ -489,65 +489,7 @@
                 <w:sz w:val="18"/>
                 <w:szCs w:val="18"/>
               </w:rPr>
-              <w:t xml:space="preserve">Reel del Mi 9</w:t>
-            </w:r>
-          </w:p>
-        </w:tc>
-        <w:tc>
-          <w:tcPr>
-            <w:tcW w:type="dxa" w:w="2200"/>
-          </w:tcPr>
-          <w:p>
-            <w:r>
-              <w:rPr>
-                <w:sz w:val="18"/>
-                <w:szCs w:val="18"/>
-              </w:rPr>
-              <w:t xml:space="preserve">antes del 9-sep</w:t>
-            </w:r>
-          </w:p>
-        </w:tc>
-      </w:tr>
-      <w:tr>
-        <w:tc>
-          <w:tcPr>
-            <w:tcW w:type="dxa" w:w="500"/>
-          </w:tcPr>
-          <w:p>
-            <w:r>
-              <w:rPr>
-                <w:sz w:val="18"/>
-                <w:szCs w:val="18"/>
-              </w:rPr>
-              <w:t xml:space="preserve">☐</w:t>
-            </w:r>
-          </w:p>
-        </w:tc>
-        <w:tc>
-          <w:tcPr>
-            <w:tcW w:type="dxa" w:w="4600"/>
-          </w:tcPr>
-          <w:p>
-            <w:r>
-              <w:rPr>
-                <w:sz w:val="18"/>
-                <w:szCs w:val="18"/>
-              </w:rPr>
-              <w:t xml:space="preserve">Crear lead magnet: Guia «Revit + ChatGPT: resuelve errores con IA»</w:t>
-            </w:r>
-          </w:p>
-        </w:tc>
-        <w:tc>
-          <w:tcPr>
-            <w:tcW w:type="dxa" w:w="3800"/>
-          </w:tcPr>
-          <w:p>
-            <w:r>
-              <w:rPr>
-                <w:sz w:val="18"/>
-                <w:szCs w:val="18"/>
-              </w:rPr>
-              <w:t xml:space="preserve">CTA GUIA de los reels de IA (Mi 9, Mar 15, Mar 22)</w:t>
+              <w:t xml:space="preserve">CTA GUIA de los reels de IA (Mi 9 y Mar 22)</w:t>
             </w:r>
           </w:p>
         </w:tc>
@@ -844,7 +786,7 @@
           <w:sz w:val="21"/>
           <w:szCs w:val="21"/>
         </w:rPr>
-        <w:t xml:space="preserve">FEED PRINCIPAL: 40% reels · 40% carruseles · 20% post plano. Se publica lunes, miercoles y viernes; los 6 reels ya grabados entran ADICIONALES los martes y sabados intermedios.</w:t>
+        <w:t xml:space="preserve">FEED PRINCIPAL: 40% reels · 40% carruseles · 20% post plano. Se publica lunes, miercoles y viernes; los 5 reels ya grabados entran ADICIONALES los martes y sabados intermedios (el sexto, «Valor 6», ya esta editado y es la pieza base del Mie 9).</w:t>
       </w:r>
     </w:p>
     <w:p>
@@ -6771,7 +6713,7 @@
           <w:sz w:val="21"/>
           <w:szCs w:val="21"/>
         </w:rPr>
-        <w:t xml:space="preserve">El mismo contenido adaptado a cada red del grupo (YouTube Shorts SOLO recibe los reels). Publicacion lunes, miercoles y viernes; los 6 reels ya grabados entran ADICIONALES los martes y sabados. Mezcla del mes: 40% reels · 40% carruseles · 20% post plano (en las 12 piezas base: 5R/5C/2P).</w:t>
+        <w:t xml:space="preserve">El mismo contenido adaptado a cada red del grupo (YouTube Shorts SOLO recibe los reels). Publicacion lunes, miercoles y viernes; los 5 reels ya grabados restantes (el #5 es el «Valor 6» ya editado y sube el Mie 9 como pieza base) entran ADICIONALES los martes y sabados. Mezcla del mes: 40% reels · 40% carruseles · 20% post plano (en las 12 piezas base: 5R/5C/2P).</w:t>
       </w:r>
     </w:p>
     <w:p>
@@ -7311,64 +7253,6 @@
                 <w:sz w:val="18"/>
                 <w:szCs w:val="18"/>
               </w:rPr>
-              <w:t xml:space="preserve">Mar 15 ★</w:t>
-            </w:r>
-          </w:p>
-        </w:tc>
-        <w:tc>
-          <w:tcPr>
-            <w:tcW w:type="dxa" w:w="2300"/>
-          </w:tcPr>
-          <w:p>
-            <w:r>
-              <w:rPr>
-                <w:sz w:val="18"/>
-                <w:szCs w:val="18"/>
-              </w:rPr>
-              <w:t xml:space="preserve">REEL extra ya grabado (#5 ChatGPT+Revit)</w:t>
-            </w:r>
-          </w:p>
-        </w:tc>
-        <w:tc>
-          <w:tcPr>
-            <w:tcW w:type="dxa" w:w="1400"/>
-          </w:tcPr>
-          <w:p>
-            <w:r>
-              <w:rPr>
-                <w:sz w:val="18"/>
-                <w:szCs w:val="18"/>
-              </w:rPr>
-              <w:t xml:space="preserve">🎯 valor</w:t>
-            </w:r>
-          </w:p>
-        </w:tc>
-        <w:tc>
-          <w:tcPr>
-            <w:tcW w:type="dxa" w:w="6100"/>
-          </w:tcPr>
-          <w:p>
-            <w:r>
-              <w:rPr>
-                <w:sz w:val="18"/>
-                <w:szCs w:val="18"/>
-              </w:rPr>
-              <w:t xml:space="preserve">Integración de ChatGPT con Revit para asistencias rápidas</w:t>
-            </w:r>
-          </w:p>
-        </w:tc>
-      </w:tr>
-      <w:tr>
-        <w:tc>
-          <w:tcPr>
-            <w:tcW w:type="dxa" w:w="1600"/>
-          </w:tcPr>
-          <w:p>
-            <w:r>
-              <w:rPr>
-                <w:sz w:val="18"/>
-                <w:szCs w:val="18"/>
-              </w:rPr>
               <w:t xml:space="preserve">Mie 16</w:t>
             </w:r>
           </w:p>
@@ -9274,7 +9158,7 @@
           <w:sz w:val="18"/>
           <w:szCs w:val="18"/>
         </w:rPr>
-        <w:t xml:space="preserve">El video ya esta terminado con el pipeline nuevo. Solo falta confirmar la palabra clave del CTA</w:t>
+        <w:t xml:space="preserve">El video ya esta terminado con el pipeline nuevo (es el grabado #5 del equipo, confirmado por</w:t>
       </w:r>
     </w:p>
     <w:p>
@@ -9291,7 +9175,7 @@
           <w:sz w:val="18"/>
           <w:szCs w:val="18"/>
         </w:rPr>
-        <w:t xml:space="preserve">(¿GUIA?) y montar su disparador. Si el equipo confirma que el grabado #5 es este mismo video,</w:t>
+        <w:t xml:space="preserve">Dayana). Solo falta confirmar la palabra clave del CTA (¿GUIA?) y montar su disparador — y que</w:t>
       </w:r>
     </w:p>
     <w:p>
@@ -9308,7 +9192,7 @@
           <w:sz w:val="18"/>
           <w:szCs w:val="18"/>
         </w:rPr>
-        <w:t xml:space="preserve">el slot del Mar 15 se cubre con uno del banco.</w:t>
+        <w:t xml:space="preserve">la guia exista antes de publicar (ver lead magnets por crear).</w:t>
       </w:r>
     </w:p>
     <w:p>
@@ -11864,7 +11748,7 @@
         <w:pBdr>
           <w:bottom w:val="single" w:color="C96A1C" w:sz="12" w:space="6"/>
         </w:pBdr>
-        <w:spacing w:after="60" w:before="340"/>
+        <w:spacing w:after="60" w:before="300"/>
       </w:pPr>
       <w:r>
         <w:rPr>
@@ -11874,7 +11758,7 @@
           <w:sz w:val="24"/>
           <w:szCs w:val="24"/>
         </w:rPr>
-        <w:t xml:space="preserve">Mar 15 ★  ·  </w:t>
+        <w:t xml:space="preserve">Mie 16  ·  </w:t>
       </w:r>
       <w:r>
         <w:rPr>
@@ -11884,7 +11768,137 @@
           <w:sz w:val="24"/>
           <w:szCs w:val="24"/>
         </w:rPr>
-        <w:t xml:space="preserve">Integración de ChatGPT con Revit para asistencias rápidas</w:t>
+        <w:t xml:space="preserve">REEL · Sobredimensionada — parte 2 (grabar)</w:t>
+      </w:r>
+    </w:p>
+    <w:p>
+      <w:pPr>
+        <w:spacing w:after="80"/>
+        <w:rPr>
+          <w:color w:val="5A6B7B"/>
+          <w:sz w:val="19"/>
+          <w:szCs w:val="19"/>
+        </w:rPr>
+      </w:pPr>
+      <w:r>
+        <w:rPr>
+          <w:color w:val="5A6B7B"/>
+          <w:sz w:val="19"/>
+          <w:szCs w:val="19"/>
+        </w:rPr>
+        <w:t xml:space="preserve">Formato: REEL talking head + b-roll (30-40s)</w:t>
+      </w:r>
+    </w:p>
+    <w:p>
+      <w:pPr>
+        <w:spacing w:after="50" w:before="150"/>
+      </w:pPr>
+      <w:r>
+        <w:rPr>
+          <w:b/>
+          <w:bCs/>
+          <w:caps/>
+          <w:color w:val="5A6B7B"/>
+          <w:sz w:val="18"/>
+          <w:szCs w:val="18"/>
+        </w:rPr>
+        <w:t xml:space="preserve">La idea (desarrollo)</w:t>
+      </w:r>
+    </w:p>
+    <w:p>
+      <w:pPr>
+        <w:pBdr>
+          <w:left w:val="single" w:color="B9C6D3" w:sz="14" w:space="8"/>
+        </w:pBdr>
+        <w:shd w:fill="F7F9FB" w:val="clear"/>
+        <w:spacing w:after="0"/>
+      </w:pPr>
+      <w:r>
+        <w:rPr>
+          <w:rFonts w:ascii="Consolas" w:cs="Consolas" w:eastAsia="Consolas" w:hAnsi="Consolas"/>
+          <w:sz w:val="18"/>
+          <w:szCs w:val="18"/>
+        </w:rPr>
+        <w:t xml:space="preserve">Continuacion del post #1 de la historia de la cuenta (14.334 vistas / 107 comentarios). Hook:</w:t>
+      </w:r>
+    </w:p>
+    <w:p>
+      <w:pPr>
+        <w:pBdr>
+          <w:left w:val="single" w:color="B9C6D3" w:sz="14" w:space="8"/>
+        </w:pBdr>
+        <w:shd w:fill="F7F9FB" w:val="clear"/>
+        <w:spacing w:after="0"/>
+      </w:pPr>
+      <w:r>
+        <w:rPr>
+          <w:rFonts w:ascii="Consolas" w:cs="Consolas" w:eastAsia="Consolas" w:hAnsi="Consolas"/>
+          <w:sz w:val="18"/>
+          <w:szCs w:val="18"/>
+        </w:rPr>
+        <w:t xml:space="preserve">«Sobredimensionar no te hace mas seguro. Te hace mas caro.» Desarrollo: 3 señales de que una</w:t>
+      </w:r>
+    </w:p>
+    <w:p>
+      <w:pPr>
+        <w:pBdr>
+          <w:left w:val="single" w:color="B9C6D3" w:sz="14" w:space="8"/>
+        </w:pBdr>
+        <w:shd w:fill="F7F9FB" w:val="clear"/>
+        <w:spacing w:after="0"/>
+      </w:pPr>
+      <w:r>
+        <w:rPr>
+          <w:rFonts w:ascii="Consolas" w:cs="Consolas" w:eastAsia="Consolas" w:hAnsi="Consolas"/>
+          <w:sz w:val="18"/>
+          <w:szCs w:val="18"/>
+        </w:rPr>
+        <w:t xml:space="preserve">viga esta sobredimensionada (sin resolverlas del todo). Cierre: comenta ACERO y te paso las 5</w:t>
+      </w:r>
+    </w:p>
+    <w:p>
+      <w:pPr>
+        <w:pBdr>
+          <w:left w:val="single" w:color="B9C6D3" w:sz="14" w:space="8"/>
+        </w:pBdr>
+        <w:shd w:fill="F7F9FB" w:val="clear"/>
+        <w:spacing w:after="140"/>
+      </w:pPr>
+      <w:r>
+        <w:rPr>
+          <w:rFonts w:ascii="Consolas" w:cs="Consolas" w:eastAsia="Consolas" w:hAnsi="Consolas"/>
+          <w:sz w:val="18"/>
+          <w:szCs w:val="18"/>
+        </w:rPr>
+        <w:t xml:space="preserve">verificaciones. Grabar en la sesion del Lun 7-Mar 8.</w:t>
+      </w:r>
+    </w:p>
+    <w:p>
+      <w:pPr>
+        <w:pBdr>
+          <w:bottom w:val="single" w:color="C96A1C" w:sz="12" w:space="6"/>
+        </w:pBdr>
+        <w:spacing w:after="60" w:before="340"/>
+      </w:pPr>
+      <w:r>
+        <w:rPr>
+          <w:b/>
+          <w:bCs/>
+          <w:color w:val="C96A1C"/>
+          <w:sz w:val="24"/>
+          <w:szCs w:val="24"/>
+        </w:rPr>
+        <w:t xml:space="preserve">Vie 18  ·  </w:t>
+      </w:r>
+      <w:r>
+        <w:rPr>
+          <w:b/>
+          <w:bCs/>
+          <w:color w:val="0E2438"/>
+          <w:sz w:val="24"/>
+          <w:szCs w:val="24"/>
+        </w:rPr>
+        <w:t xml:space="preserve">Paquete Autodesk para coordinación BIM</w:t>
       </w:r>
     </w:p>
     <w:tbl>
@@ -11993,7 +12007,7 @@
                 <w:sz w:val="18"/>
                 <w:szCs w:val="18"/>
               </w:rPr>
-              <w:t xml:space="preserve">REEL extra ya grabado (#5 ChatGPT+Revit)</w:t>
+              <w:t xml:space="preserve">REEL (grabar o banco)</w:t>
             </w:r>
           </w:p>
         </w:tc>
@@ -12021,7 +12035,7 @@
                 <w:sz w:val="18"/>
                 <w:szCs w:val="18"/>
               </w:rPr>
-              <w:t xml:space="preserve">IA · Educativo</w:t>
+              <w:t xml:space="preserve">BIM · Venta</w:t>
             </w:r>
           </w:p>
         </w:tc>
@@ -12066,919 +12080,7 @@
           <w:sz w:val="20"/>
           <w:szCs w:val="20"/>
         </w:rPr>
-        <w:t xml:space="preserve">⚠ Si este video es el mismo «Valor 6» del Mi 9, aqui sube en su lugar uno del banco (ago-venta-paquete-autodesk).</w:t>
-      </w:r>
-    </w:p>
-    <w:p>
-      <w:pPr>
-        <w:spacing w:after="50" w:before="150"/>
-      </w:pPr>
-      <w:r>
-        <w:rPr>
-          <w:b/>
-          <w:bCs/>
-          <w:caps/>
-          <w:color w:val="5A6B7B"/>
-          <w:sz w:val="18"/>
-          <w:szCs w:val="18"/>
-        </w:rPr>
-        <w:t xml:space="preserve">Hook (los primeros 3 segundos / el primer slide)</w:t>
-      </w:r>
-    </w:p>
-    <w:p>
-      <w:pPr>
-        <w:pBdr>
-          <w:left w:val="single" w:color="C96A1C" w:sz="20" w:space="8"/>
-        </w:pBdr>
-        <w:shd w:fill="FDF1E4" w:val="clear"/>
-        <w:spacing w:after="140"/>
-      </w:pPr>
-      <w:r>
-        <w:rPr>
-          <w:b/>
-          <w:bCs/>
-          <w:color w:val="0E2438"/>
-          <w:sz w:val="21"/>
-          <w:szCs w:val="21"/>
-        </w:rPr>
-        <w:t xml:space="preserve">Le pegué un error de Revit a ChatGPT y me ahorró 2 horas de buscar en foros.</w:t>
-      </w:r>
-    </w:p>
-    <w:p>
-      <w:pPr>
-        <w:spacing w:after="50" w:before="150"/>
-      </w:pPr>
-      <w:r>
-        <w:rPr>
-          <w:b/>
-          <w:bCs/>
-          <w:caps/>
-          <w:color w:val="5A6B7B"/>
-          <w:sz w:val="18"/>
-          <w:szCs w:val="18"/>
-        </w:rPr>
-        <w:t xml:space="preserve">Guion del reel — segundo a segundo</w:t>
-      </w:r>
-    </w:p>
-    <w:tbl>
-      <w:tblPr>
-        <w:tblW w:type="dxa" w:w="10200"/>
-        <w:tblBorders>
-          <w:top w:val="single" w:color="auto" w:sz="4"/>
-          <w:left w:val="single" w:color="auto" w:sz="4"/>
-          <w:bottom w:val="single" w:color="auto" w:sz="4"/>
-          <w:right w:val="single" w:color="auto" w:sz="4"/>
-          <w:insideH w:val="single" w:color="auto" w:sz="4"/>
-          <w:insideV w:val="single" w:color="auto" w:sz="4"/>
-        </w:tblBorders>
-      </w:tblPr>
-      <w:tblGrid>
-        <w:gridCol w:w="1300"/>
-        <w:gridCol w:w="3100"/>
-        <w:gridCol w:w="5800"/>
-      </w:tblGrid>
-      <w:tr>
-        <w:trPr>
-          <w:tblHeader/>
-        </w:trPr>
-        <w:tc>
-          <w:tcPr>
-            <w:tcW w:type="dxa" w:w="1300"/>
-            <w:shd w:fill="0E2438" w:val="clear"/>
-          </w:tcPr>
-          <w:p>
-            <w:r>
-              <w:rPr>
-                <w:b/>
-                <w:bCs/>
-                <w:color w:val="FFFFFF"/>
-                <w:sz w:val="18"/>
-                <w:szCs w:val="18"/>
-              </w:rPr>
-              <w:t xml:space="preserve">Tiempo</w:t>
-            </w:r>
-          </w:p>
-        </w:tc>
-        <w:tc>
-          <w:tcPr>
-            <w:tcW w:type="dxa" w:w="3100"/>
-            <w:shd w:fill="0E2438" w:val="clear"/>
-          </w:tcPr>
-          <w:p>
-            <w:r>
-              <w:rPr>
-                <w:b/>
-                <w:bCs/>
-                <w:color w:val="FFFFFF"/>
-                <w:sz w:val="18"/>
-                <w:szCs w:val="18"/>
-              </w:rPr>
-              <w:t xml:space="preserve">Qué se ve en pantalla</w:t>
-            </w:r>
-          </w:p>
-        </w:tc>
-        <w:tc>
-          <w:tcPr>
-            <w:tcW w:type="dxa" w:w="5800"/>
-            <w:shd w:fill="0E2438" w:val="clear"/>
-          </w:tcPr>
-          <w:p>
-            <w:r>
-              <w:rPr>
-                <w:b/>
-                <w:bCs/>
-                <w:color w:val="FFFFFF"/>
-                <w:sz w:val="18"/>
-                <w:szCs w:val="18"/>
-              </w:rPr>
-              <w:t xml:space="preserve">Qué se dice (voz / texto)</w:t>
-            </w:r>
-          </w:p>
-        </w:tc>
-      </w:tr>
-      <w:tr>
-        <w:tc>
-          <w:tcPr>
-            <w:tcW w:type="dxa" w:w="1300"/>
-          </w:tcPr>
-          <w:p>
-            <w:r>
-              <w:rPr>
-                <w:sz w:val="18"/>
-                <w:szCs w:val="18"/>
-              </w:rPr>
-              <w:t xml:space="preserve">0-3s</w:t>
-            </w:r>
-          </w:p>
-        </w:tc>
-        <w:tc>
-          <w:tcPr>
-            <w:tcW w:type="dxa" w:w="3100"/>
-          </w:tcPr>
-          <w:p>
-            <w:r>
-              <w:rPr>
-                <w:sz w:val="18"/>
-                <w:szCs w:val="18"/>
-              </w:rPr>
-              <w:t xml:space="preserve">Pantalla con un error/warning de Revit</w:t>
-            </w:r>
-          </w:p>
-        </w:tc>
-        <w:tc>
-          <w:tcPr>
-            <w:tcW w:type="dxa" w:w="5800"/>
-          </w:tcPr>
-          <w:p>
-            <w:r>
-              <w:rPr>
-                <w:sz w:val="18"/>
-                <w:szCs w:val="18"/>
-              </w:rPr>
-              <w:t xml:space="preserve">Me salió este error en Revit. En vez de buscar en foros…</w:t>
-            </w:r>
-          </w:p>
-        </w:tc>
-      </w:tr>
-      <w:tr>
-        <w:tc>
-          <w:tcPr>
-            <w:tcW w:type="dxa" w:w="1300"/>
-          </w:tcPr>
-          <w:p>
-            <w:r>
-              <w:rPr>
-                <w:sz w:val="18"/>
-                <w:szCs w:val="18"/>
-              </w:rPr>
-              <w:t xml:space="preserve">3-16s</w:t>
-            </w:r>
-          </w:p>
-        </w:tc>
-        <w:tc>
-          <w:tcPr>
-            <w:tcW w:type="dxa" w:w="3100"/>
-          </w:tcPr>
-          <w:p>
-            <w:r>
-              <w:rPr>
-                <w:sz w:val="18"/>
-                <w:szCs w:val="18"/>
-              </w:rPr>
-              <w:t xml:space="preserve">Copiar el error → ChatGPT → respuesta</w:t>
-            </w:r>
-          </w:p>
-        </w:tc>
-        <w:tc>
-          <w:tcPr>
-            <w:tcW w:type="dxa" w:w="5800"/>
-          </w:tcPr>
-          <w:p>
-            <w:r>
-              <w:rPr>
-                <w:sz w:val="18"/>
-                <w:szCs w:val="18"/>
-              </w:rPr>
-              <w:t xml:space="preserve">Se lo pegué a ChatGPT, le di contexto del proyecto, y me explicó la causa y 2 formas de resolverlo. En segundos.</w:t>
-            </w:r>
-          </w:p>
-        </w:tc>
-      </w:tr>
-      <w:tr>
-        <w:tc>
-          <w:tcPr>
-            <w:tcW w:type="dxa" w:w="1300"/>
-          </w:tcPr>
-          <w:p>
-            <w:r>
-              <w:rPr>
-                <w:sz w:val="18"/>
-                <w:szCs w:val="18"/>
-              </w:rPr>
-              <w:t xml:space="preserve">16-25s</w:t>
-            </w:r>
-          </w:p>
-        </w:tc>
-        <w:tc>
-          <w:tcPr>
-            <w:tcW w:type="dxa" w:w="3100"/>
-          </w:tcPr>
-          <w:p>
-            <w:r>
-              <w:rPr>
-                <w:sz w:val="18"/>
-                <w:szCs w:val="18"/>
-              </w:rPr>
-              <w:t xml:space="preserve">Aplicar la solución + CTA</w:t>
-            </w:r>
-          </w:p>
-        </w:tc>
-        <w:tc>
-          <w:tcPr>
-            <w:tcW w:type="dxa" w:w="5800"/>
-          </w:tcPr>
-          <w:p>
-            <w:r>
-              <w:rPr>
-                <w:sz w:val="18"/>
-                <w:szCs w:val="18"/>
-              </w:rPr>
-              <w:t xml:space="preserve">Ojo: verifiqué antes de aplicar — la IA se equivoca. Pero como punto de partida, vuela. Comenta ‘BIM’ o ‘IA’ y te enseño a usarla bien.</w:t>
-            </w:r>
-          </w:p>
-        </w:tc>
-      </w:tr>
-    </w:tbl>
-    <w:p>
-      <w:pPr>
-        <w:spacing w:after="50" w:before="150"/>
-      </w:pPr>
-      <w:r>
-        <w:rPr>
-          <w:b/>
-          <w:bCs/>
-          <w:caps/>
-          <w:color w:val="5A6B7B"/>
-          <w:sz w:val="18"/>
-          <w:szCs w:val="18"/>
-        </w:rPr>
-        <w:t xml:space="preserve">Descripción / caption completo — listo para copiar</w:t>
-      </w:r>
-    </w:p>
-    <w:p>
-      <w:pPr>
-        <w:pBdr>
-          <w:left w:val="single" w:color="B9C6D3" w:sz="14" w:space="8"/>
-        </w:pBdr>
-        <w:shd w:fill="F7F9FB" w:val="clear"/>
-        <w:spacing w:after="0"/>
-      </w:pPr>
-      <w:r>
-        <w:rPr>
-          <w:rFonts w:ascii="Consolas" w:cs="Consolas" w:eastAsia="Consolas" w:hAnsi="Consolas"/>
-          <w:sz w:val="18"/>
-          <w:szCs w:val="18"/>
-        </w:rPr>
-        <w:t xml:space="preserve">ChatGPT no reemplaza tu criterio, pero como asistente de Revit te ahorra horas: explica</w:t>
-      </w:r>
-    </w:p>
-    <w:p>
-      <w:pPr>
-        <w:pBdr>
-          <w:left w:val="single" w:color="B9C6D3" w:sz="14" w:space="8"/>
-        </w:pBdr>
-        <w:shd w:fill="F7F9FB" w:val="clear"/>
-        <w:spacing w:after="0"/>
-      </w:pPr>
-      <w:r>
-        <w:rPr>
-          <w:rFonts w:ascii="Consolas" w:cs="Consolas" w:eastAsia="Consolas" w:hAnsi="Consolas"/>
-          <w:sz w:val="18"/>
-          <w:szCs w:val="18"/>
-        </w:rPr>
-        <w:t xml:space="preserve">errores, sugiere flujos, redacta especificaciones. Siempre verifica antes de aplicar.</w:t>
-      </w:r>
-    </w:p>
-    <w:p>
-      <w:pPr>
-        <w:pBdr>
-          <w:left w:val="single" w:color="B9C6D3" w:sz="14" w:space="8"/>
-        </w:pBdr>
-        <w:shd w:fill="F7F9FB" w:val="clear"/>
-        <w:spacing w:after="0"/>
-      </w:pPr>
-      <w:r>
-        <w:rPr>
-          <w:rFonts w:ascii="Consolas" w:cs="Consolas" w:eastAsia="Consolas" w:hAnsi="Consolas"/>
-          <w:sz w:val="18"/>
-          <w:szCs w:val="18"/>
-        </w:rPr>
-        <w:t xml:space="preserve"> </w:t>
-      </w:r>
-    </w:p>
-    <w:p>
-      <w:pPr>
-        <w:pBdr>
-          <w:left w:val="single" w:color="B9C6D3" w:sz="14" w:space="8"/>
-        </w:pBdr>
-        <w:shd w:fill="F7F9FB" w:val="clear"/>
-        <w:spacing w:after="0"/>
-      </w:pPr>
-      <w:r>
-        <w:rPr>
-          <w:rFonts w:ascii="Consolas" w:cs="Consolas" w:eastAsia="Consolas" w:hAnsi="Consolas"/>
-          <w:sz w:val="18"/>
-          <w:szCs w:val="18"/>
-        </w:rPr>
-        <w:t xml:space="preserve">💬 Comenta “BIM” o “IA” y te enseño cómo integrarla en tu día a día.</w:t>
-      </w:r>
-    </w:p>
-    <w:p>
-      <w:pPr>
-        <w:pBdr>
-          <w:left w:val="single" w:color="B9C6D3" w:sz="14" w:space="8"/>
-        </w:pBdr>
-        <w:shd w:fill="F7F9FB" w:val="clear"/>
-        <w:spacing w:after="0"/>
-      </w:pPr>
-      <w:r>
-        <w:rPr>
-          <w:rFonts w:ascii="Consolas" w:cs="Consolas" w:eastAsia="Consolas" w:hAnsi="Consolas"/>
-          <w:sz w:val="18"/>
-          <w:szCs w:val="18"/>
-        </w:rPr>
-        <w:t xml:space="preserve"> </w:t>
-      </w:r>
-    </w:p>
-    <w:p>
-      <w:pPr>
-        <w:pBdr>
-          <w:left w:val="single" w:color="B9C6D3" w:sz="14" w:space="8"/>
-        </w:pBdr>
-        <w:shd w:fill="F7F9FB" w:val="clear"/>
-        <w:spacing w:after="140"/>
-      </w:pPr>
-      <w:r>
-        <w:rPr>
-          <w:rFonts w:ascii="Consolas" w:cs="Consolas" w:eastAsia="Consolas" w:hAnsi="Consolas"/>
-          <w:sz w:val="18"/>
-          <w:szCs w:val="18"/>
-        </w:rPr>
-        <w:t xml:space="preserve">#ChatGPT #Revit #BIM #IA #DesignModelingDG</w:t>
-      </w:r>
-    </w:p>
-    <w:p>
-      <w:pPr>
-        <w:spacing w:after="50" w:before="150"/>
-      </w:pPr>
-      <w:r>
-        <w:rPr>
-          <w:b/>
-          <w:bCs/>
-          <w:caps/>
-          <w:color w:val="5A6B7B"/>
-          <w:sz w:val="18"/>
-          <w:szCs w:val="18"/>
-        </w:rPr>
-        <w:t xml:space="preserve">CTA por red</w:t>
-      </w:r>
-    </w:p>
-    <w:tbl>
-      <w:tblPr>
-        <w:tblW w:type="dxa" w:w="10200"/>
-        <w:tblBorders>
-          <w:top w:val="single" w:color="auto" w:sz="4"/>
-          <w:left w:val="single" w:color="auto" w:sz="4"/>
-          <w:bottom w:val="single" w:color="auto" w:sz="4"/>
-          <w:right w:val="single" w:color="auto" w:sz="4"/>
-          <w:insideH w:val="single" w:color="auto" w:sz="4"/>
-          <w:insideV w:val="single" w:color="auto" w:sz="4"/>
-        </w:tblBorders>
-      </w:tblPr>
-      <w:tblGrid>
-        <w:gridCol w:w="1800"/>
-        <w:gridCol w:w="8400"/>
-      </w:tblGrid>
-      <w:tr>
-        <w:trPr>
-          <w:tblHeader/>
-        </w:trPr>
-        <w:tc>
-          <w:tcPr>
-            <w:tcW w:type="dxa" w:w="1800"/>
-            <w:shd w:fill="0E2438" w:val="clear"/>
-          </w:tcPr>
-          <w:p>
-            <w:r>
-              <w:rPr>
-                <w:b/>
-                <w:bCs/>
-                <w:color w:val="FFFFFF"/>
-                <w:sz w:val="18"/>
-                <w:szCs w:val="18"/>
-              </w:rPr>
-              <w:t xml:space="preserve">Red</w:t>
-            </w:r>
-          </w:p>
-        </w:tc>
-        <w:tc>
-          <w:tcPr>
-            <w:tcW w:type="dxa" w:w="8400"/>
-            <w:shd w:fill="0E2438" w:val="clear"/>
-          </w:tcPr>
-          <w:p>
-            <w:r>
-              <w:rPr>
-                <w:b/>
-                <w:bCs/>
-                <w:color w:val="FFFFFF"/>
-                <w:sz w:val="18"/>
-                <w:szCs w:val="18"/>
-              </w:rPr>
-              <w:t xml:space="preserve">Cómo se cierra ahí</w:t>
-            </w:r>
-          </w:p>
-        </w:tc>
-      </w:tr>
-      <w:tr>
-        <w:tc>
-          <w:tcPr>
-            <w:tcW w:type="dxa" w:w="1800"/>
-          </w:tcPr>
-          <w:p>
-            <w:r>
-              <w:rPr>
-                <w:sz w:val="18"/>
-                <w:szCs w:val="18"/>
-              </w:rPr>
-              <w:t xml:space="preserve">Instagram</w:t>
-            </w:r>
-          </w:p>
-        </w:tc>
-        <w:tc>
-          <w:tcPr>
-            <w:tcW w:type="dxa" w:w="8400"/>
-          </w:tcPr>
-          <w:p>
-            <w:r>
-              <w:rPr>
-                <w:sz w:val="18"/>
-                <w:szCs w:val="18"/>
-              </w:rPr>
-              <w:t xml:space="preserve">Comenta “BIM” o “IA” y te mando la info por DM.</w:t>
-            </w:r>
-          </w:p>
-        </w:tc>
-      </w:tr>
-      <w:tr>
-        <w:tc>
-          <w:tcPr>
-            <w:tcW w:type="dxa" w:w="1800"/>
-          </w:tcPr>
-          <w:p>
-            <w:r>
-              <w:rPr>
-                <w:sz w:val="18"/>
-                <w:szCs w:val="18"/>
-              </w:rPr>
-              <w:t xml:space="preserve">LinkedIn</w:t>
-            </w:r>
-          </w:p>
-        </w:tc>
-        <w:tc>
-          <w:tcPr>
-            <w:tcW w:type="dxa" w:w="8400"/>
-          </w:tcPr>
-          <w:p>
-            <w:r>
-              <w:rPr>
-                <w:sz w:val="18"/>
-                <w:szCs w:val="18"/>
-              </w:rPr>
-              <w:t xml:space="preserve">¿Cómo lo ven en sus proyectos? Coméntenme o escríbanme por DM.</w:t>
-            </w:r>
-          </w:p>
-        </w:tc>
-      </w:tr>
-      <w:tr>
-        <w:tc>
-          <w:tcPr>
-            <w:tcW w:type="dxa" w:w="1800"/>
-          </w:tcPr>
-          <w:p>
-            <w:r>
-              <w:rPr>
-                <w:sz w:val="18"/>
-                <w:szCs w:val="18"/>
-              </w:rPr>
-              <w:t xml:space="preserve">TikTok</w:t>
-            </w:r>
-          </w:p>
-        </w:tc>
-        <w:tc>
-          <w:tcPr>
-            <w:tcW w:type="dxa" w:w="8400"/>
-          </w:tcPr>
-          <w:p>
-            <w:r>
-              <w:rPr>
-                <w:sz w:val="18"/>
-                <w:szCs w:val="18"/>
-              </w:rPr>
-              <w:t xml:space="preserve">Comenta “BIM” o “IA” · link en bio.</w:t>
-            </w:r>
-          </w:p>
-        </w:tc>
-      </w:tr>
-      <w:tr>
-        <w:tc>
-          <w:tcPr>
-            <w:tcW w:type="dxa" w:w="1800"/>
-          </w:tcPr>
-          <w:p>
-            <w:r>
-              <w:rPr>
-                <w:sz w:val="18"/>
-                <w:szCs w:val="18"/>
-              </w:rPr>
-              <w:t xml:space="preserve">YouTube</w:t>
-            </w:r>
-          </w:p>
-        </w:tc>
-        <w:tc>
-          <w:tcPr>
-            <w:tcW w:type="dxa" w:w="8400"/>
-          </w:tcPr>
-          <w:p>
-            <w:r>
-              <w:rPr>
-                <w:sz w:val="18"/>
-                <w:szCs w:val="18"/>
-              </w:rPr>
-              <w:t xml:space="preserve">Paso a paso completo en el video · link en la descripción.</w:t>
-            </w:r>
-          </w:p>
-        </w:tc>
-      </w:tr>
-    </w:tbl>
-    <w:p>
-      <w:pPr>
-        <w:pBdr>
-          <w:bottom w:val="single" w:color="C96A1C" w:sz="12" w:space="6"/>
-        </w:pBdr>
-        <w:spacing w:after="60" w:before="300"/>
-      </w:pPr>
-      <w:r>
-        <w:rPr>
-          <w:b/>
-          <w:bCs/>
-          <w:color w:val="C96A1C"/>
-          <w:sz w:val="24"/>
-          <w:szCs w:val="24"/>
-        </w:rPr>
-        <w:t xml:space="preserve">Mie 16  ·  </w:t>
-      </w:r>
-      <w:r>
-        <w:rPr>
-          <w:b/>
-          <w:bCs/>
-          <w:color w:val="0E2438"/>
-          <w:sz w:val="24"/>
-          <w:szCs w:val="24"/>
-        </w:rPr>
-        <w:t xml:space="preserve">REEL · Sobredimensionada — parte 2 (grabar)</w:t>
-      </w:r>
-    </w:p>
-    <w:p>
-      <w:pPr>
-        <w:spacing w:after="80"/>
-        <w:rPr>
-          <w:color w:val="5A6B7B"/>
-          <w:sz w:val="19"/>
-          <w:szCs w:val="19"/>
-        </w:rPr>
-      </w:pPr>
-      <w:r>
-        <w:rPr>
-          <w:color w:val="5A6B7B"/>
-          <w:sz w:val="19"/>
-          <w:szCs w:val="19"/>
-        </w:rPr>
-        <w:t xml:space="preserve">Formato: REEL talking head + b-roll (30-40s)</w:t>
-      </w:r>
-    </w:p>
-    <w:p>
-      <w:pPr>
-        <w:spacing w:after="50" w:before="150"/>
-      </w:pPr>
-      <w:r>
-        <w:rPr>
-          <w:b/>
-          <w:bCs/>
-          <w:caps/>
-          <w:color w:val="5A6B7B"/>
-          <w:sz w:val="18"/>
-          <w:szCs w:val="18"/>
-        </w:rPr>
-        <w:t xml:space="preserve">La idea (desarrollo)</w:t>
-      </w:r>
-    </w:p>
-    <w:p>
-      <w:pPr>
-        <w:pBdr>
-          <w:left w:val="single" w:color="B9C6D3" w:sz="14" w:space="8"/>
-        </w:pBdr>
-        <w:shd w:fill="F7F9FB" w:val="clear"/>
-        <w:spacing w:after="0"/>
-      </w:pPr>
-      <w:r>
-        <w:rPr>
-          <w:rFonts w:ascii="Consolas" w:cs="Consolas" w:eastAsia="Consolas" w:hAnsi="Consolas"/>
-          <w:sz w:val="18"/>
-          <w:szCs w:val="18"/>
-        </w:rPr>
-        <w:t xml:space="preserve">Continuacion del post #1 de la historia de la cuenta (14.334 vistas / 107 comentarios). Hook:</w:t>
-      </w:r>
-    </w:p>
-    <w:p>
-      <w:pPr>
-        <w:pBdr>
-          <w:left w:val="single" w:color="B9C6D3" w:sz="14" w:space="8"/>
-        </w:pBdr>
-        <w:shd w:fill="F7F9FB" w:val="clear"/>
-        <w:spacing w:after="0"/>
-      </w:pPr>
-      <w:r>
-        <w:rPr>
-          <w:rFonts w:ascii="Consolas" w:cs="Consolas" w:eastAsia="Consolas" w:hAnsi="Consolas"/>
-          <w:sz w:val="18"/>
-          <w:szCs w:val="18"/>
-        </w:rPr>
-        <w:t xml:space="preserve">«Sobredimensionar no te hace mas seguro. Te hace mas caro.» Desarrollo: 3 señales de que una</w:t>
-      </w:r>
-    </w:p>
-    <w:p>
-      <w:pPr>
-        <w:pBdr>
-          <w:left w:val="single" w:color="B9C6D3" w:sz="14" w:space="8"/>
-        </w:pBdr>
-        <w:shd w:fill="F7F9FB" w:val="clear"/>
-        <w:spacing w:after="0"/>
-      </w:pPr>
-      <w:r>
-        <w:rPr>
-          <w:rFonts w:ascii="Consolas" w:cs="Consolas" w:eastAsia="Consolas" w:hAnsi="Consolas"/>
-          <w:sz w:val="18"/>
-          <w:szCs w:val="18"/>
-        </w:rPr>
-        <w:t xml:space="preserve">viga esta sobredimensionada (sin resolverlas del todo). Cierre: comenta ACERO y te paso las 5</w:t>
-      </w:r>
-    </w:p>
-    <w:p>
-      <w:pPr>
-        <w:pBdr>
-          <w:left w:val="single" w:color="B9C6D3" w:sz="14" w:space="8"/>
-        </w:pBdr>
-        <w:shd w:fill="F7F9FB" w:val="clear"/>
-        <w:spacing w:after="140"/>
-      </w:pPr>
-      <w:r>
-        <w:rPr>
-          <w:rFonts w:ascii="Consolas" w:cs="Consolas" w:eastAsia="Consolas" w:hAnsi="Consolas"/>
-          <w:sz w:val="18"/>
-          <w:szCs w:val="18"/>
-        </w:rPr>
-        <w:t xml:space="preserve">verificaciones. Grabar en la sesion del Lun 7-Mar 8.</w:t>
-      </w:r>
-    </w:p>
-    <w:p>
-      <w:pPr>
-        <w:pBdr>
-          <w:bottom w:val="single" w:color="C96A1C" w:sz="12" w:space="6"/>
-        </w:pBdr>
-        <w:spacing w:after="60" w:before="340"/>
-      </w:pPr>
-      <w:r>
-        <w:rPr>
-          <w:b/>
-          <w:bCs/>
-          <w:color w:val="C96A1C"/>
-          <w:sz w:val="24"/>
-          <w:szCs w:val="24"/>
-        </w:rPr>
-        <w:t xml:space="preserve">Vie 18  ·  </w:t>
-      </w:r>
-      <w:r>
-        <w:rPr>
-          <w:b/>
-          <w:bCs/>
-          <w:color w:val="0E2438"/>
-          <w:sz w:val="24"/>
-          <w:szCs w:val="24"/>
-        </w:rPr>
-        <w:t xml:space="preserve">Paquete Autodesk para coordinación BIM</w:t>
-      </w:r>
-    </w:p>
-    <w:tbl>
-      <w:tblPr>
-        <w:tblW w:type="dxa" w:w="10200"/>
-        <w:tblBorders>
-          <w:top w:val="single" w:color="auto" w:sz="4"/>
-          <w:left w:val="single" w:color="auto" w:sz="4"/>
-          <w:bottom w:val="single" w:color="auto" w:sz="4"/>
-          <w:right w:val="single" w:color="auto" w:sz="4"/>
-          <w:insideH w:val="single" w:color="auto" w:sz="4"/>
-          <w:insideV w:val="single" w:color="auto" w:sz="4"/>
-        </w:tblBorders>
-      </w:tblPr>
-      <w:tblGrid>
-        <w:gridCol w:w="1900"/>
-        <w:gridCol w:w="3400"/>
-        <w:gridCol w:w="1700"/>
-        <w:gridCol w:w="3200"/>
-      </w:tblGrid>
-      <w:tr>
-        <w:trPr>
-          <w:tblHeader/>
-        </w:trPr>
-        <w:tc>
-          <w:tcPr>
-            <w:tcW w:type="dxa" w:w="1900"/>
-            <w:shd w:fill="0E2438" w:val="clear"/>
-          </w:tcPr>
-          <w:p>
-            <w:r>
-              <w:rPr>
-                <w:b/>
-                <w:bCs/>
-                <w:color w:val="FFFFFF"/>
-                <w:sz w:val="18"/>
-                <w:szCs w:val="18"/>
-              </w:rPr>
-              <w:t xml:space="preserve">Formato</w:t>
-            </w:r>
-          </w:p>
-        </w:tc>
-        <w:tc>
-          <w:tcPr>
-            <w:tcW w:type="dxa" w:w="3400"/>
-            <w:shd w:fill="0E2438" w:val="clear"/>
-          </w:tcPr>
-          <w:p>
-            <w:r>
-              <w:rPr>
-                <w:b/>
-                <w:bCs/>
-                <w:color w:val="FFFFFF"/>
-                <w:sz w:val="18"/>
-                <w:szCs w:val="18"/>
-              </w:rPr>
-              <w:t xml:space="preserve">Redes</w:t>
-            </w:r>
-          </w:p>
-        </w:tc>
-        <w:tc>
-          <w:tcPr>
-            <w:tcW w:type="dxa" w:w="1700"/>
-            <w:shd w:fill="0E2438" w:val="clear"/>
-          </w:tcPr>
-          <w:p>
-            <w:r>
-              <w:rPr>
-                <w:b/>
-                <w:bCs/>
-                <w:color w:val="FFFFFF"/>
-                <w:sz w:val="18"/>
-                <w:szCs w:val="18"/>
-              </w:rPr>
-              <w:t xml:space="preserve">Eje</w:t>
-            </w:r>
-          </w:p>
-        </w:tc>
-        <w:tc>
-          <w:tcPr>
-            <w:tcW w:type="dxa" w:w="3200"/>
-            <w:shd w:fill="0E2438" w:val="clear"/>
-          </w:tcPr>
-          <w:p>
-            <w:r>
-              <w:rPr>
-                <w:b/>
-                <w:bCs/>
-                <w:color w:val="FFFFFF"/>
-                <w:sz w:val="18"/>
-                <w:szCs w:val="18"/>
-              </w:rPr>
-              <w:t xml:space="preserve">Producto / palabra clave</w:t>
-            </w:r>
-          </w:p>
-        </w:tc>
-      </w:tr>
-      <w:tr>
-        <w:tc>
-          <w:tcPr>
-            <w:tcW w:type="dxa" w:w="1900"/>
-          </w:tcPr>
-          <w:p>
-            <w:r>
-              <w:rPr>
-                <w:sz w:val="18"/>
-                <w:szCs w:val="18"/>
-              </w:rPr>
-              <w:t xml:space="preserve">REEL (grabar o banco)</w:t>
-            </w:r>
-          </w:p>
-        </w:tc>
-        <w:tc>
-          <w:tcPr>
-            <w:tcW w:type="dxa" w:w="3400"/>
-          </w:tcPr>
-          <w:p>
-            <w:r>
-              <w:rPr>
-                <w:sz w:val="18"/>
-                <w:szCs w:val="18"/>
-              </w:rPr>
-              <w:t xml:space="preserve">(las del grupo)</w:t>
-            </w:r>
-          </w:p>
-        </w:tc>
-        <w:tc>
-          <w:tcPr>
-            <w:tcW w:type="dxa" w:w="1700"/>
-          </w:tcPr>
-          <w:p>
-            <w:r>
-              <w:rPr>
-                <w:sz w:val="18"/>
-                <w:szCs w:val="18"/>
-              </w:rPr>
-              <w:t xml:space="preserve">BIM · Venta</w:t>
-            </w:r>
-          </w:p>
-        </w:tc>
-        <w:tc>
-          <w:tcPr>
-            <w:tcW w:type="dxa" w:w="3200"/>
-          </w:tcPr>
-          <w:p>
-            <w:r>
-              <w:rPr>
-                <w:sz w:val="18"/>
-                <w:szCs w:val="18"/>
-              </w:rPr>
-              <w:t xml:space="preserve">Máster BIM + IA</w:t>
-            </w:r>
-          </w:p>
-          <w:p>
-            <w:r>
-              <w:rPr>
-                <w:sz w:val="18"/>
-                <w:szCs w:val="18"/>
-              </w:rPr>
-              <w:t xml:space="preserve">→ «BIM / IA»</w:t>
-            </w:r>
-          </w:p>
-        </w:tc>
-      </w:tr>
-    </w:tbl>
-    <w:p>
-      <w:pPr>
-        <w:pBdr>
-          <w:left w:val="single" w:color="C96A1C" w:sz="18" w:space="8"/>
-        </w:pBdr>
-        <w:shd w:fill="F4F7FA" w:val="clear"/>
-        <w:spacing w:after="100"/>
-      </w:pPr>
-      <w:r>
-        <w:rPr>
-          <w:i/>
-          <w:iCs/>
-          <w:color w:val="5A6B7B"/>
-          <w:sz w:val="20"/>
-          <w:szCs w:val="20"/>
-        </w:rPr>
-        <w:t xml:space="preserve">Paquete Autodesk para coordinacion — venta blanda con valor. Si el slot del Mar 15 consumio esta pieza, aqui entra ago-derivas-deformaciones como carrusel.</w:t>
+        <w:t xml:space="preserve">Paquete Autodesk para coordinacion — venta blanda con valor. Grabar en la sesion del 7-8 o tomar del banco.</w:t>
       </w:r>
     </w:p>
     <w:p>
@@ -35692,7 +34794,7 @@
                 <w:sz w:val="18"/>
                 <w:szCs w:val="18"/>
               </w:rPr>
-              <w:t xml:space="preserve">11</w:t>
+              <w:t xml:space="preserve">10</w:t>
             </w:r>
           </w:p>
         </w:tc>
@@ -35737,7 +34839,7 @@
           <w:sz w:val="21"/>
           <w:szCs w:val="21"/>
         </w:rPr>
-        <w:t xml:space="preserve">El mes por grupos: 12 piezas base de feed (5 reels · 5 carruseles · 2 posts planos = 40/40/20) + 6 reels ya grabados como extras de martes y sabado + 12 mensajes de comunidades (Ma-Ju-Vi) + 4 blogs de sabado + 20 publicaciones de LinkedIn (L-V, 3 paginas) + historias diarias L-V con la venta los jueves + 4 correos + el paquete de publicidad de las 2 campañas que se sube completo el 7-sep. Todos los grupos cuentan la misma historia semanal adaptada a su canal.</w:t>
+        <w:t xml:space="preserve">El mes por grupos: 12 piezas base de feed (5 reels · 5 carruseles · 2 posts planos = 40/40/20) + 5 reels ya grabados como extras de martes y sabado (el sexto, «Valor 6», es pieza base del Mie 9) + 12 mensajes de comunidades (Ma-Ju-Vi) + 4 blogs de sabado + 20 publicaciones de LinkedIn (L-V, 3 paginas) + historias diarias L-V con la venta los jueves + 4 correos + el paquete de publicidad de las 2 campañas que se sube completo el 7-sep. Todos los grupos cuentan la misma historia semanal adaptada a su canal.</w:t>
       </w:r>
     </w:p>
     <w:p>

</xml_diff>

<commit_message>
Mapa CTA → recurso: cada promesa del mes verificada contra un lead magnet vivo
Peticion directa de Dayana. Las 12 filas cruzan cada CTA del mes (feed, extras,
comunidades, blogs, historias, correos y pauta) con el recurso que entrega, su
estado real y el CTA de reemplazo si el recurso no llega a tiempo — la regla de
seguridad que salio del incidente de julio: la palabra se cambia, la promesa
vacia no se publica. Dos recursos quedan marcados POR CREAR (la guia
Revit+ChatGPT, de la que depende el CTA del Valor 6, y el pack Dynamo/Python) y
dos existentes con palabra por confirmar (GPT, EBOOK).

Co-Authored-By: Claude Fable 5 <noreply@anthropic.com>
Claude-Session: https://claude.ai/code/session_01KESLfcCy2ne1PvhuvNrN6q
</commit_message>
<xml_diff>
--- a/matriz-viral/entregables/Matriz-Contenido-Septiembre-2026-DMA.docx
+++ b/matriz-viral/entregables/Matriz-Contenido-Septiembre-2026-DMA.docx
@@ -475,7 +475,7 @@
                 <w:sz w:val="18"/>
                 <w:szCs w:val="18"/>
               </w:rPr>
-              <w:t xml:space="preserve">Crear lead magnet: Guia «Revit + ChatGPT: resuelve errores con IA»</w:t>
+              <w:t xml:space="preserve">Crear lead magnet: Guia «Revit + ChatGPT: resuelve errores con IA» + montar disparador GUIA</w:t>
             </w:r>
           </w:p>
         </w:tc>
@@ -503,7 +503,7 @@
                 <w:sz w:val="18"/>
                 <w:szCs w:val="18"/>
               </w:rPr>
-              <w:t xml:space="preserve">semana 1</w:t>
+              <w:t xml:space="preserve">antes del Mie 9 (o el CTA del Valor 6 cambia a GPT y se regenera el subtitulo)</w:t>
             </w:r>
           </w:p>
         </w:tc>
@@ -32096,6 +32096,1207 @@
         <w:t xml:space="preserve">Version corta del test alineada a las 4 puertas para el CTA RUTA. Mientras no exista, RUTA responde con orientacion 1-a-1 del equipo y el Test de Nivelacion cubre el diagnostico.</w:t>
       </w:r>
     </w:p>
+    <w:p>
+      <w:pPr>
+        <w:spacing w:after="100" w:before="280"/>
+      </w:pPr>
+      <w:r>
+        <w:rPr>
+          <w:b/>
+          <w:bCs/>
+          <w:color w:val="C96A1C"/>
+          <w:sz w:val="26"/>
+          <w:szCs w:val="26"/>
+        </w:rPr>
+        <w:t xml:space="preserve">Mapa CTA → recurso: cada promesa del mes, verificada</w:t>
+      </w:r>
+    </w:p>
+    <w:p>
+      <w:pPr>
+        <w:spacing w:after="80"/>
+        <w:rPr>
+          <w:b/>
+          <w:bCs/>
+          <w:color w:val="A33B2A"/>
+        </w:rPr>
+      </w:pPr>
+      <w:r>
+        <w:rPr>
+          <w:b/>
+          <w:bCs/>
+          <w:color w:val="A33B2A"/>
+          <w:sz w:val="21"/>
+          <w:szCs w:val="21"/>
+        </w:rPr>
+        <w:t xml:space="preserve">REGLA DE SEGURIDAD (leccion de julio): ningun CTA sale al aire sin su recurso VIVO y su disparador montado el dia de la publicacion. Si el recurso no llego a tiempo, NO se aplaza la pieza: se publica con el CTA de reemplazo de esta tabla. Prometer y no entregar cuesta mas que cambiar la palabra.</w:t>
+      </w:r>
+    </w:p>
+    <w:tbl>
+      <w:tblPr>
+        <w:tblW w:type="dxa" w:w="12100"/>
+        <w:tblBorders>
+          <w:top w:val="single" w:color="auto" w:sz="4"/>
+          <w:left w:val="single" w:color="auto" w:sz="4"/>
+          <w:bottom w:val="single" w:color="auto" w:sz="4"/>
+          <w:right w:val="single" w:color="auto" w:sz="4"/>
+          <w:insideH w:val="single" w:color="auto" w:sz="4"/>
+          <w:insideV w:val="single" w:color="auto" w:sz="4"/>
+        </w:tblBorders>
+      </w:tblPr>
+      <w:tblGrid>
+        <w:gridCol w:w="1500"/>
+        <w:gridCol w:w="2400"/>
+        <w:gridCol w:w="900"/>
+        <w:gridCol w:w="2400"/>
+        <w:gridCol w:w="2000"/>
+        <w:gridCol w:w="2900"/>
+      </w:tblGrid>
+      <w:tr>
+        <w:trPr>
+          <w:tblHeader/>
+        </w:trPr>
+        <w:tc>
+          <w:tcPr>
+            <w:tcW w:type="dxa" w:w="1500"/>
+            <w:shd w:fill="0E2438" w:val="clear"/>
+          </w:tcPr>
+          <w:p>
+            <w:r>
+              <w:rPr>
+                <w:b/>
+                <w:bCs/>
+                <w:color w:val="FFFFFF"/>
+                <w:sz w:val="18"/>
+                <w:szCs w:val="18"/>
+              </w:rPr>
+              <w:t xml:space="preserve">Cuándo</w:t>
+            </w:r>
+          </w:p>
+        </w:tc>
+        <w:tc>
+          <w:tcPr>
+            <w:tcW w:type="dxa" w:w="2400"/>
+            <w:shd w:fill="0E2438" w:val="clear"/>
+          </w:tcPr>
+          <w:p>
+            <w:r>
+              <w:rPr>
+                <w:b/>
+                <w:bCs/>
+                <w:color w:val="FFFFFF"/>
+                <w:sz w:val="18"/>
+                <w:szCs w:val="18"/>
+              </w:rPr>
+              <w:t xml:space="preserve">Pieza</w:t>
+            </w:r>
+          </w:p>
+        </w:tc>
+        <w:tc>
+          <w:tcPr>
+            <w:tcW w:type="dxa" w:w="900"/>
+            <w:shd w:fill="0E2438" w:val="clear"/>
+          </w:tcPr>
+          <w:p>
+            <w:r>
+              <w:rPr>
+                <w:b/>
+                <w:bCs/>
+                <w:color w:val="FFFFFF"/>
+                <w:sz w:val="18"/>
+                <w:szCs w:val="18"/>
+              </w:rPr>
+              <w:t xml:space="preserve">CTA</w:t>
+            </w:r>
+          </w:p>
+        </w:tc>
+        <w:tc>
+          <w:tcPr>
+            <w:tcW w:type="dxa" w:w="2400"/>
+            <w:shd w:fill="0E2438" w:val="clear"/>
+          </w:tcPr>
+          <w:p>
+            <w:r>
+              <w:rPr>
+                <w:b/>
+                <w:bCs/>
+                <w:color w:val="FFFFFF"/>
+                <w:sz w:val="18"/>
+                <w:szCs w:val="18"/>
+              </w:rPr>
+              <w:t xml:space="preserve">Recurso que entrega</w:t>
+            </w:r>
+          </w:p>
+        </w:tc>
+        <w:tc>
+          <w:tcPr>
+            <w:tcW w:type="dxa" w:w="2000"/>
+            <w:shd w:fill="0E2438" w:val="clear"/>
+          </w:tcPr>
+          <w:p>
+            <w:r>
+              <w:rPr>
+                <w:b/>
+                <w:bCs/>
+                <w:color w:val="FFFFFF"/>
+                <w:sz w:val="18"/>
+                <w:szCs w:val="18"/>
+              </w:rPr>
+              <w:t xml:space="preserve">Estado</w:t>
+            </w:r>
+          </w:p>
+        </w:tc>
+        <w:tc>
+          <w:tcPr>
+            <w:tcW w:type="dxa" w:w="2900"/>
+            <w:shd w:fill="0E2438" w:val="clear"/>
+          </w:tcPr>
+          <w:p>
+            <w:r>
+              <w:rPr>
+                <w:b/>
+                <w:bCs/>
+                <w:color w:val="FFFFFF"/>
+                <w:sz w:val="18"/>
+                <w:szCs w:val="18"/>
+              </w:rPr>
+              <w:t xml:space="preserve">Reemplazo si no llega</w:t>
+            </w:r>
+          </w:p>
+        </w:tc>
+      </w:tr>
+      <w:tr>
+        <w:tc>
+          <w:tcPr>
+            <w:tcW w:type="dxa" w:w="1500"/>
+          </w:tcPr>
+          <w:p>
+            <w:r>
+              <w:rPr>
+                <w:sz w:val="18"/>
+                <w:szCs w:val="18"/>
+              </w:rPr>
+              <w:t xml:space="preserve">L7, Mar 8, L14, V18, L21</w:t>
+            </w:r>
+          </w:p>
+        </w:tc>
+        <w:tc>
+          <w:tcPr>
+            <w:tcW w:type="dxa" w:w="2400"/>
+          </w:tcPr>
+          <w:p>
+            <w:r>
+              <w:rPr>
+                <w:sz w:val="18"/>
+                <w:szCs w:val="18"/>
+              </w:rPr>
+              <w:t xml:space="preserve">Carruseles y reels de BIM (3 señales, Coordinador, Navisworks, Autodesk, errores Revit)</w:t>
+            </w:r>
+          </w:p>
+        </w:tc>
+        <w:tc>
+          <w:tcPr>
+            <w:tcW w:type="dxa" w:w="900"/>
+          </w:tcPr>
+          <w:p>
+            <w:r>
+              <w:rPr>
+                <w:sz w:val="18"/>
+                <w:szCs w:val="18"/>
+              </w:rPr>
+              <w:t xml:space="preserve">BIM / IA</w:t>
+            </w:r>
+          </w:p>
+        </w:tc>
+        <w:tc>
+          <w:tcPr>
+            <w:tcW w:type="dxa" w:w="2400"/>
+          </w:tcPr>
+          <w:p>
+            <w:r>
+              <w:rPr>
+                <w:sz w:val="18"/>
+                <w:szCs w:val="18"/>
+              </w:rPr>
+              <w:t xml:space="preserve">Seguimiento del bot hacia el Master (conversacion, no recurso)</w:t>
+            </w:r>
+          </w:p>
+        </w:tc>
+        <w:tc>
+          <w:tcPr>
+            <w:tcW w:type="dxa" w:w="2000"/>
+          </w:tcPr>
+          <w:p>
+            <w:r>
+              <w:rPr>
+                <w:sz w:val="18"/>
+                <w:szCs w:val="18"/>
+              </w:rPr>
+              <w:t xml:space="preserve">✅ Disparadores BIM e IA montados y probados</w:t>
+            </w:r>
+          </w:p>
+        </w:tc>
+        <w:tc>
+          <w:tcPr>
+            <w:tcW w:type="dxa" w:w="2900"/>
+          </w:tcPr>
+          <w:p>
+            <w:r>
+              <w:rPr>
+                <w:sz w:val="18"/>
+                <w:szCs w:val="18"/>
+              </w:rPr>
+              <w:t xml:space="preserve">—</w:t>
+            </w:r>
+          </w:p>
+        </w:tc>
+      </w:tr>
+      <w:tr>
+        <w:tc>
+          <w:tcPr>
+            <w:tcW w:type="dxa" w:w="1500"/>
+          </w:tcPr>
+          <w:p>
+            <w:r>
+              <w:rPr>
+                <w:sz w:val="18"/>
+                <w:szCs w:val="18"/>
+              </w:rPr>
+              <w:t xml:space="preserve">Mi 9</w:t>
+            </w:r>
+          </w:p>
+        </w:tc>
+        <w:tc>
+          <w:tcPr>
+            <w:tcW w:type="dxa" w:w="2400"/>
+          </w:tcPr>
+          <w:p>
+            <w:r>
+              <w:rPr>
+                <w:sz w:val="18"/>
+                <w:szCs w:val="18"/>
+              </w:rPr>
+              <w:t xml:space="preserve">REEL Valor 6 (error Revit + ChatGPT)</w:t>
+            </w:r>
+          </w:p>
+        </w:tc>
+        <w:tc>
+          <w:tcPr>
+            <w:tcW w:type="dxa" w:w="900"/>
+          </w:tcPr>
+          <w:p>
+            <w:r>
+              <w:rPr>
+                <w:sz w:val="18"/>
+                <w:szCs w:val="18"/>
+              </w:rPr>
+              <w:t xml:space="preserve">GUIA</w:t>
+            </w:r>
+          </w:p>
+        </w:tc>
+        <w:tc>
+          <w:tcPr>
+            <w:tcW w:type="dxa" w:w="2400"/>
+          </w:tcPr>
+          <w:p>
+            <w:r>
+              <w:rPr>
+                <w:sz w:val="18"/>
+                <w:szCs w:val="18"/>
+              </w:rPr>
+              <w:t xml:space="preserve">Guia «Revit + ChatGPT: resuelve errores con IA»</w:t>
+            </w:r>
+          </w:p>
+        </w:tc>
+        <w:tc>
+          <w:tcPr>
+            <w:tcW w:type="dxa" w:w="2000"/>
+          </w:tcPr>
+          <w:p>
+            <w:r>
+              <w:rPr>
+                <w:sz w:val="18"/>
+                <w:szCs w:val="18"/>
+              </w:rPr>
+              <w:t xml:space="preserve">🔴 POR CREAR + disparador por montar</w:t>
+            </w:r>
+          </w:p>
+        </w:tc>
+        <w:tc>
+          <w:tcPr>
+            <w:tcW w:type="dxa" w:w="2900"/>
+          </w:tcPr>
+          <w:p>
+            <w:r>
+              <w:rPr>
+                <w:sz w:val="18"/>
+                <w:szCs w:val="18"/>
+              </w:rPr>
+              <w:t xml:space="preserve">Si no esta el dia 9: CTA cambia a «comenta GPT» → GPT IA Pro (existe). El subtitulo del video dice COMENTA GUIA — si se cambia el CTA hay que regenerar el subtitulo (5 min con el pipeline).</w:t>
+            </w:r>
+          </w:p>
+        </w:tc>
+      </w:tr>
+      <w:tr>
+        <w:tc>
+          <w:tcPr>
+            <w:tcW w:type="dxa" w:w="1500"/>
+          </w:tcPr>
+          <w:p>
+            <w:r>
+              <w:rPr>
+                <w:sz w:val="18"/>
+                <w:szCs w:val="18"/>
+              </w:rPr>
+              <w:t xml:space="preserve">V11, Mi16, V2oct</w:t>
+            </w:r>
+          </w:p>
+        </w:tc>
+        <w:tc>
+          <w:tcPr>
+            <w:tcW w:type="dxa" w:w="2400"/>
+          </w:tcPr>
+          <w:p>
+            <w:r>
+              <w:rPr>
+                <w:sz w:val="18"/>
+                <w:szCs w:val="18"/>
+              </w:rPr>
+              <w:t xml:space="preserve">Posts de dato de calculo + Sobredimensionada 2</w:t>
+            </w:r>
+          </w:p>
+        </w:tc>
+        <w:tc>
+          <w:tcPr>
+            <w:tcW w:type="dxa" w:w="900"/>
+          </w:tcPr>
+          <w:p>
+            <w:r>
+              <w:rPr>
+                <w:sz w:val="18"/>
+                <w:szCs w:val="18"/>
+              </w:rPr>
+              <w:t xml:space="preserve">ACERO</w:t>
+            </w:r>
+          </w:p>
+        </w:tc>
+        <w:tc>
+          <w:tcPr>
+            <w:tcW w:type="dxa" w:w="2400"/>
+          </w:tcPr>
+          <w:p>
+            <w:r>
+              <w:rPr>
+                <w:sz w:val="18"/>
+                <w:szCs w:val="18"/>
+              </w:rPr>
+              <w:t xml:space="preserve">Verificacion de Acero (5 Verificaciones)</w:t>
+            </w:r>
+          </w:p>
+        </w:tc>
+        <w:tc>
+          <w:tcPr>
+            <w:tcW w:type="dxa" w:w="2000"/>
+          </w:tcPr>
+          <w:p>
+            <w:r>
+              <w:rPr>
+                <w:sz w:val="18"/>
+                <w:szCs w:val="18"/>
+              </w:rPr>
+              <w:t xml:space="preserve">✅ Existe, embudo verificado, palabra montada</w:t>
+            </w:r>
+          </w:p>
+        </w:tc>
+        <w:tc>
+          <w:tcPr>
+            <w:tcW w:type="dxa" w:w="2900"/>
+          </w:tcPr>
+          <w:p>
+            <w:r>
+              <w:rPr>
+                <w:sz w:val="18"/>
+                <w:szCs w:val="18"/>
+              </w:rPr>
+              <w:t xml:space="preserve">—</w:t>
+            </w:r>
+          </w:p>
+        </w:tc>
+      </w:tr>
+      <w:tr>
+        <w:tc>
+          <w:tcPr>
+            <w:tcW w:type="dxa" w:w="1500"/>
+          </w:tcPr>
+          <w:p>
+            <w:r>
+              <w:rPr>
+                <w:sz w:val="18"/>
+                <w:szCs w:val="18"/>
+              </w:rPr>
+              <w:t xml:space="preserve">Sab 12, Sab 19</w:t>
+            </w:r>
+          </w:p>
+        </w:tc>
+        <w:tc>
+          <w:tcPr>
+            <w:tcW w:type="dxa" w:w="2400"/>
+          </w:tcPr>
+          <w:p>
+            <w:r>
+              <w:rPr>
+                <w:sz w:val="18"/>
+                <w:szCs w:val="18"/>
+              </w:rPr>
+              <w:t xml:space="preserve">Reels grabados #4 Dynamo y #6 Python</w:t>
+            </w:r>
+          </w:p>
+        </w:tc>
+        <w:tc>
+          <w:tcPr>
+            <w:tcW w:type="dxa" w:w="900"/>
+          </w:tcPr>
+          <w:p>
+            <w:r>
+              <w:rPr>
+                <w:sz w:val="18"/>
+                <w:szCs w:val="18"/>
+              </w:rPr>
+              <w:t xml:space="preserve">DYNAMO</w:t>
+            </w:r>
+          </w:p>
+        </w:tc>
+        <w:tc>
+          <w:tcPr>
+            <w:tcW w:type="dxa" w:w="2400"/>
+          </w:tcPr>
+          <w:p>
+            <w:r>
+              <w:rPr>
+                <w:sz w:val="18"/>
+                <w:szCs w:val="18"/>
+              </w:rPr>
+              <w:t xml:space="preserve">Pack starter de scripts Dynamo / Python</w:t>
+            </w:r>
+          </w:p>
+        </w:tc>
+        <w:tc>
+          <w:tcPr>
+            <w:tcW w:type="dxa" w:w="2000"/>
+          </w:tcPr>
+          <w:p>
+            <w:r>
+              <w:rPr>
+                <w:sz w:val="18"/>
+                <w:szCs w:val="18"/>
+              </w:rPr>
+              <w:t xml:space="preserve">🔴 POR CREAR + disparador por montar</w:t>
+            </w:r>
+          </w:p>
+        </w:tc>
+        <w:tc>
+          <w:tcPr>
+            <w:tcW w:type="dxa" w:w="2900"/>
+          </w:tcPr>
+          <w:p>
+            <w:r>
+              <w:rPr>
+                <w:sz w:val="18"/>
+                <w:szCs w:val="18"/>
+              </w:rPr>
+              <w:t xml:space="preserve">Si no esta: CTA cambia a «comenta BIM» (bot Master) y el pack queda para octubre.</w:t>
+            </w:r>
+          </w:p>
+        </w:tc>
+      </w:tr>
+      <w:tr>
+        <w:tc>
+          <w:tcPr>
+            <w:tcW w:type="dxa" w:w="1500"/>
+          </w:tcPr>
+          <w:p>
+            <w:r>
+              <w:rPr>
+                <w:sz w:val="18"/>
+                <w:szCs w:val="18"/>
+              </w:rPr>
+              <w:t xml:space="preserve">Mar 22</w:t>
+            </w:r>
+          </w:p>
+        </w:tc>
+        <w:tc>
+          <w:tcPr>
+            <w:tcW w:type="dxa" w:w="2400"/>
+          </w:tcPr>
+          <w:p>
+            <w:r>
+              <w:rPr>
+                <w:sz w:val="18"/>
+                <w:szCs w:val="18"/>
+              </w:rPr>
+              <w:t xml:space="preserve">Reel grabado #7 Mitos de la automatizacion</w:t>
+            </w:r>
+          </w:p>
+        </w:tc>
+        <w:tc>
+          <w:tcPr>
+            <w:tcW w:type="dxa" w:w="900"/>
+          </w:tcPr>
+          <w:p>
+            <w:r>
+              <w:rPr>
+                <w:sz w:val="18"/>
+                <w:szCs w:val="18"/>
+              </w:rPr>
+              <w:t xml:space="preserve">IA</w:t>
+            </w:r>
+          </w:p>
+        </w:tc>
+        <w:tc>
+          <w:tcPr>
+            <w:tcW w:type="dxa" w:w="2400"/>
+          </w:tcPr>
+          <w:p>
+            <w:r>
+              <w:rPr>
+                <w:sz w:val="18"/>
+                <w:szCs w:val="18"/>
+              </w:rPr>
+              <w:t xml:space="preserve">Seguimiento del bot (y GPT IA Pro como regalo en el DM)</w:t>
+            </w:r>
+          </w:p>
+        </w:tc>
+        <w:tc>
+          <w:tcPr>
+            <w:tcW w:type="dxa" w:w="2000"/>
+          </w:tcPr>
+          <w:p>
+            <w:r>
+              <w:rPr>
+                <w:sz w:val="18"/>
+                <w:szCs w:val="18"/>
+              </w:rPr>
+              <w:t xml:space="preserve">✅ Disparador IA montado; GPT IA Pro existe</w:t>
+            </w:r>
+          </w:p>
+        </w:tc>
+        <w:tc>
+          <w:tcPr>
+            <w:tcW w:type="dxa" w:w="2900"/>
+          </w:tcPr>
+          <w:p>
+            <w:r>
+              <w:rPr>
+                <w:sz w:val="18"/>
+                <w:szCs w:val="18"/>
+              </w:rPr>
+              <w:t xml:space="preserve">—</w:t>
+            </w:r>
+          </w:p>
+        </w:tc>
+      </w:tr>
+      <w:tr>
+        <w:tc>
+          <w:tcPr>
+            <w:tcW w:type="dxa" w:w="1500"/>
+          </w:tcPr>
+          <w:p>
+            <w:r>
+              <w:rPr>
+                <w:sz w:val="18"/>
+                <w:szCs w:val="18"/>
+              </w:rPr>
+              <w:t xml:space="preserve">Mi 23, V25 + correo Mar 22 + comunidad Jue 24</w:t>
+            </w:r>
+          </w:p>
+        </w:tc>
+        <w:tc>
+          <w:tcPr>
+            <w:tcW w:type="dxa" w:w="2400"/>
+          </w:tcPr>
+          <w:p>
+            <w:r>
+              <w:rPr>
+                <w:sz w:val="18"/>
+                <w:szCs w:val="18"/>
+              </w:rPr>
+              <w:t xml:space="preserve">Carrusel 4 Puertas, reel espejo, correo Master</w:t>
+            </w:r>
+          </w:p>
+        </w:tc>
+        <w:tc>
+          <w:tcPr>
+            <w:tcW w:type="dxa" w:w="900"/>
+          </w:tcPr>
+          <w:p>
+            <w:r>
+              <w:rPr>
+                <w:sz w:val="18"/>
+                <w:szCs w:val="18"/>
+              </w:rPr>
+              <w:t xml:space="preserve">RUTA</w:t>
+            </w:r>
+          </w:p>
+        </w:tc>
+        <w:tc>
+          <w:tcPr>
+            <w:tcW w:type="dxa" w:w="2400"/>
+          </w:tcPr>
+          <w:p>
+            <w:r>
+              <w:rPr>
+                <w:sz w:val="18"/>
+                <w:szCs w:val="18"/>
+              </w:rPr>
+              <w:t xml:space="preserve">Orientacion 1-a-1 del equipo (el Test de Nivelacion cubre el diagnostico)</w:t>
+            </w:r>
+          </w:p>
+        </w:tc>
+        <w:tc>
+          <w:tcPr>
+            <w:tcW w:type="dxa" w:w="2000"/>
+          </w:tcPr>
+          <w:p>
+            <w:r>
+              <w:rPr>
+                <w:sz w:val="18"/>
+                <w:szCs w:val="18"/>
+              </w:rPr>
+              <w:t xml:space="preserve">🟡 Recurso existe (test), DISPARADOR RUTA por montar</w:t>
+            </w:r>
+          </w:p>
+        </w:tc>
+        <w:tc>
+          <w:tcPr>
+            <w:tcW w:type="dxa" w:w="2900"/>
+          </w:tcPr>
+          <w:p>
+            <w:r>
+              <w:rPr>
+                <w:sz w:val="18"/>
+                <w:szCs w:val="18"/>
+              </w:rPr>
+              <w:t xml:space="preserve">Si el disparador no esta el 22: CTA cambia a «comenta NIVEL» → Test de Nivelacion (montado).</w:t>
+            </w:r>
+          </w:p>
+        </w:tc>
+      </w:tr>
+      <w:tr>
+        <w:tc>
+          <w:tcPr>
+            <w:tcW w:type="dxa" w:w="1500"/>
+          </w:tcPr>
+          <w:p>
+            <w:r>
+              <w:rPr>
+                <w:sz w:val="18"/>
+                <w:szCs w:val="18"/>
+              </w:rPr>
+              <w:t xml:space="preserve">Sab 26</w:t>
+            </w:r>
+          </w:p>
+        </w:tc>
+        <w:tc>
+          <w:tcPr>
+            <w:tcW w:type="dxa" w:w="2400"/>
+          </w:tcPr>
+          <w:p>
+            <w:r>
+              <w:rPr>
+                <w:sz w:val="18"/>
+                <w:szCs w:val="18"/>
+              </w:rPr>
+              <w:t xml:space="preserve">Reel grabado #8 IA para arquitectura</w:t>
+            </w:r>
+          </w:p>
+        </w:tc>
+        <w:tc>
+          <w:tcPr>
+            <w:tcW w:type="dxa" w:w="900"/>
+          </w:tcPr>
+          <w:p>
+            <w:r>
+              <w:rPr>
+                <w:sz w:val="18"/>
+                <w:szCs w:val="18"/>
+              </w:rPr>
+              <w:t xml:space="preserve">IA</w:t>
+            </w:r>
+          </w:p>
+        </w:tc>
+        <w:tc>
+          <w:tcPr>
+            <w:tcW w:type="dxa" w:w="2400"/>
+          </w:tcPr>
+          <w:p>
+            <w:r>
+              <w:rPr>
+                <w:sz w:val="18"/>
+                <w:szCs w:val="18"/>
+              </w:rPr>
+              <w:t xml:space="preserve">Bot Master + GPT IA Pro</w:t>
+            </w:r>
+          </w:p>
+        </w:tc>
+        <w:tc>
+          <w:tcPr>
+            <w:tcW w:type="dxa" w:w="2000"/>
+          </w:tcPr>
+          <w:p>
+            <w:r>
+              <w:rPr>
+                <w:sz w:val="18"/>
+                <w:szCs w:val="18"/>
+              </w:rPr>
+              <w:t xml:space="preserve">✅ Montado</w:t>
+            </w:r>
+          </w:p>
+        </w:tc>
+        <w:tc>
+          <w:tcPr>
+            <w:tcW w:type="dxa" w:w="2900"/>
+          </w:tcPr>
+          <w:p>
+            <w:r>
+              <w:rPr>
+                <w:sz w:val="18"/>
+                <w:szCs w:val="18"/>
+              </w:rPr>
+              <w:t xml:space="preserve">—</w:t>
+            </w:r>
+          </w:p>
+        </w:tc>
+      </w:tr>
+      <w:tr>
+        <w:tc>
+          <w:tcPr>
+            <w:tcW w:type="dxa" w:w="1500"/>
+          </w:tcPr>
+          <w:p>
+            <w:r>
+              <w:rPr>
+                <w:sz w:val="18"/>
+                <w:szCs w:val="18"/>
+              </w:rPr>
+              <w:t xml:space="preserve">L28, Mi30 + correo Mar 29</w:t>
+            </w:r>
+          </w:p>
+        </w:tc>
+        <w:tc>
+          <w:tcPr>
+            <w:tcW w:type="dxa" w:w="2400"/>
+          </w:tcPr>
+          <w:p>
+            <w:r>
+              <w:rPr>
+                <w:sz w:val="18"/>
+                <w:szCs w:val="18"/>
+              </w:rPr>
+              <w:t xml:space="preserve">Anuncio y demo del tutor de IA</w:t>
+            </w:r>
+          </w:p>
+        </w:tc>
+        <w:tc>
+          <w:tcPr>
+            <w:tcW w:type="dxa" w:w="900"/>
+          </w:tcPr>
+          <w:p>
+            <w:r>
+              <w:rPr>
+                <w:sz w:val="18"/>
+                <w:szCs w:val="18"/>
+              </w:rPr>
+              <w:t xml:space="preserve">ACERO</w:t>
+            </w:r>
+          </w:p>
+        </w:tc>
+        <w:tc>
+          <w:tcPr>
+            <w:tcW w:type="dxa" w:w="2400"/>
+          </w:tcPr>
+          <w:p>
+            <w:r>
+              <w:rPr>
+                <w:sz w:val="18"/>
+                <w:szCs w:val="18"/>
+              </w:rPr>
+              <w:t xml:space="preserve">5 Verificaciones + temario (el tutor es feature del curso, NO lead magnet)</w:t>
+            </w:r>
+          </w:p>
+        </w:tc>
+        <w:tc>
+          <w:tcPr>
+            <w:tcW w:type="dxa" w:w="2000"/>
+          </w:tcPr>
+          <w:p>
+            <w:r>
+              <w:rPr>
+                <w:sz w:val="18"/>
+                <w:szCs w:val="18"/>
+              </w:rPr>
+              <w:t xml:space="preserve">🟡 Palabra montada; piezas CONDICIONADAS al deploy del tutor</w:t>
+            </w:r>
+          </w:p>
+        </w:tc>
+        <w:tc>
+          <w:tcPr>
+            <w:tcW w:type="dxa" w:w="2900"/>
+          </w:tcPr>
+          <w:p>
+            <w:r>
+              <w:rPr>
+                <w:sz w:val="18"/>
+                <w:szCs w:val="18"/>
+              </w:rPr>
+              <w:t xml:space="preserve">Si el tutor no esta: suben piezas del banco y estas pasan a octubre.</w:t>
+            </w:r>
+          </w:p>
+        </w:tc>
+      </w:tr>
+      <w:tr>
+        <w:tc>
+          <w:tcPr>
+            <w:tcW w:type="dxa" w:w="1500"/>
+          </w:tcPr>
+          <w:p>
+            <w:r>
+              <w:rPr>
+                <w:sz w:val="18"/>
+                <w:szCs w:val="18"/>
+              </w:rPr>
+              <w:t xml:space="preserve">Comunidad Jue 17</w:t>
+            </w:r>
+          </w:p>
+        </w:tc>
+        <w:tc>
+          <w:tcPr>
+            <w:tcW w:type="dxa" w:w="2400"/>
+          </w:tcPr>
+          <w:p>
+            <w:r>
+              <w:rPr>
+                <w:sz w:val="18"/>
+                <w:szCs w:val="18"/>
+              </w:rPr>
+              <w:t xml:space="preserve">Mensaje del recurso gratis</w:t>
+            </w:r>
+          </w:p>
+        </w:tc>
+        <w:tc>
+          <w:tcPr>
+            <w:tcW w:type="dxa" w:w="900"/>
+          </w:tcPr>
+          <w:p>
+            <w:r>
+              <w:rPr>
+                <w:sz w:val="18"/>
+                <w:szCs w:val="18"/>
+              </w:rPr>
+              <w:t xml:space="preserve">ZAPATA</w:t>
+            </w:r>
+          </w:p>
+        </w:tc>
+        <w:tc>
+          <w:tcPr>
+            <w:tcW w:type="dxa" w:w="2400"/>
+          </w:tcPr>
+          <w:p>
+            <w:r>
+              <w:rPr>
+                <w:sz w:val="18"/>
+                <w:szCs w:val="18"/>
+              </w:rPr>
+              <w:t xml:space="preserve">Calculadora de Zapatas</w:t>
+            </w:r>
+          </w:p>
+        </w:tc>
+        <w:tc>
+          <w:tcPr>
+            <w:tcW w:type="dxa" w:w="2000"/>
+          </w:tcPr>
+          <w:p>
+            <w:r>
+              <w:rPr>
+                <w:sz w:val="18"/>
+                <w:szCs w:val="18"/>
+              </w:rPr>
+              <w:t xml:space="preserve">✅ Embudo completo probado</w:t>
+            </w:r>
+          </w:p>
+        </w:tc>
+        <w:tc>
+          <w:tcPr>
+            <w:tcW w:type="dxa" w:w="2900"/>
+          </w:tcPr>
+          <w:p>
+            <w:r>
+              <w:rPr>
+                <w:sz w:val="18"/>
+                <w:szCs w:val="18"/>
+              </w:rPr>
+              <w:t xml:space="preserve">—</w:t>
+            </w:r>
+          </w:p>
+        </w:tc>
+      </w:tr>
+      <w:tr>
+        <w:tc>
+          <w:tcPr>
+            <w:tcW w:type="dxa" w:w="1500"/>
+          </w:tcPr>
+          <w:p>
+            <w:r>
+              <w:rPr>
+                <w:sz w:val="18"/>
+                <w:szCs w:val="18"/>
+              </w:rPr>
+              <w:t xml:space="preserve">Comunidad Vie 25 + blog Sab 26</w:t>
+            </w:r>
+          </w:p>
+        </w:tc>
+        <w:tc>
+          <w:tcPr>
+            <w:tcW w:type="dxa" w:w="2400"/>
+          </w:tcPr>
+          <w:p>
+            <w:r>
+              <w:rPr>
+                <w:sz w:val="18"/>
+                <w:szCs w:val="18"/>
+              </w:rPr>
+              <w:t xml:space="preserve">Test de nivel + blog elegir software</w:t>
+            </w:r>
+          </w:p>
+        </w:tc>
+        <w:tc>
+          <w:tcPr>
+            <w:tcW w:type="dxa" w:w="900"/>
+          </w:tcPr>
+          <w:p>
+            <w:r>
+              <w:rPr>
+                <w:sz w:val="18"/>
+                <w:szCs w:val="18"/>
+              </w:rPr>
+              <w:t xml:space="preserve">NIVEL</w:t>
+            </w:r>
+          </w:p>
+        </w:tc>
+        <w:tc>
+          <w:tcPr>
+            <w:tcW w:type="dxa" w:w="2400"/>
+          </w:tcPr>
+          <w:p>
+            <w:r>
+              <w:rPr>
+                <w:sz w:val="18"/>
+                <w:szCs w:val="18"/>
+              </w:rPr>
+              <w:t xml:space="preserve">Test de Nivelacion BIM (+ Curso Introductorio como segundo regalo)</w:t>
+            </w:r>
+          </w:p>
+        </w:tc>
+        <w:tc>
+          <w:tcPr>
+            <w:tcW w:type="dxa" w:w="2000"/>
+          </w:tcPr>
+          <w:p>
+            <w:r>
+              <w:rPr>
+                <w:sz w:val="18"/>
+                <w:szCs w:val="18"/>
+              </w:rPr>
+              <w:t xml:space="preserve">✅ Montado (redirect corregido en agosto)</w:t>
+            </w:r>
+          </w:p>
+        </w:tc>
+        <w:tc>
+          <w:tcPr>
+            <w:tcW w:type="dxa" w:w="2900"/>
+          </w:tcPr>
+          <w:p>
+            <w:r>
+              <w:rPr>
+                <w:sz w:val="18"/>
+                <w:szCs w:val="18"/>
+              </w:rPr>
+              <w:t xml:space="preserve">—</w:t>
+            </w:r>
+          </w:p>
+        </w:tc>
+      </w:tr>
+      <w:tr>
+        <w:tc>
+          <w:tcPr>
+            <w:tcW w:type="dxa" w:w="1500"/>
+          </w:tcPr>
+          <w:p>
+            <w:r>
+              <w:rPr>
+                <w:sz w:val="18"/>
+                <w:szCs w:val="18"/>
+              </w:rPr>
+              <w:t xml:space="preserve">Blog Sab 12</w:t>
+            </w:r>
+          </w:p>
+        </w:tc>
+        <w:tc>
+          <w:tcPr>
+            <w:tcW w:type="dxa" w:w="2400"/>
+          </w:tcPr>
+          <w:p>
+            <w:r>
+              <w:rPr>
+                <w:sz w:val="18"/>
+                <w:szCs w:val="18"/>
+              </w:rPr>
+              <w:t xml:space="preserve">Articulo IA en arquitectura</w:t>
+            </w:r>
+          </w:p>
+        </w:tc>
+        <w:tc>
+          <w:tcPr>
+            <w:tcW w:type="dxa" w:w="900"/>
+          </w:tcPr>
+          <w:p>
+            <w:r>
+              <w:rPr>
+                <w:sz w:val="18"/>
+                <w:szCs w:val="18"/>
+              </w:rPr>
+              <w:t xml:space="preserve">GPT</w:t>
+            </w:r>
+          </w:p>
+        </w:tc>
+        <w:tc>
+          <w:tcPr>
+            <w:tcW w:type="dxa" w:w="2400"/>
+          </w:tcPr>
+          <w:p>
+            <w:r>
+              <w:rPr>
+                <w:sz w:val="18"/>
+                <w:szCs w:val="18"/>
+              </w:rPr>
+              <w:t xml:space="preserve">GPT IA Pro</w:t>
+            </w:r>
+          </w:p>
+        </w:tc>
+        <w:tc>
+          <w:tcPr>
+            <w:tcW w:type="dxa" w:w="2000"/>
+          </w:tcPr>
+          <w:p>
+            <w:r>
+              <w:rPr>
+                <w:sz w:val="18"/>
+                <w:szCs w:val="18"/>
+              </w:rPr>
+              <w:t xml:space="preserve">🟡 Existe; CONFIRMAR la palabra montada en el bot</w:t>
+            </w:r>
+          </w:p>
+        </w:tc>
+        <w:tc>
+          <w:tcPr>
+            <w:tcW w:type="dxa" w:w="2900"/>
+          </w:tcPr>
+          <w:p>
+            <w:r>
+              <w:rPr>
+                <w:sz w:val="18"/>
+                <w:szCs w:val="18"/>
+              </w:rPr>
+              <w:t xml:space="preserve">Enlace directo en el blog (en blog el enlace si va directo).</w:t>
+            </w:r>
+          </w:p>
+        </w:tc>
+      </w:tr>
+      <w:tr>
+        <w:tc>
+          <w:tcPr>
+            <w:tcW w:type="dxa" w:w="1500"/>
+          </w:tcPr>
+          <w:p>
+            <w:r>
+              <w:rPr>
+                <w:sz w:val="18"/>
+                <w:szCs w:val="18"/>
+              </w:rPr>
+              <w:t xml:space="preserve">Blog Sab 3-oct</w:t>
+            </w:r>
+          </w:p>
+        </w:tc>
+        <w:tc>
+          <w:tcPr>
+            <w:tcW w:type="dxa" w:w="2400"/>
+          </w:tcPr>
+          <w:p>
+            <w:r>
+              <w:rPr>
+                <w:sz w:val="18"/>
+                <w:szCs w:val="18"/>
+              </w:rPr>
+              <w:t xml:space="preserve">Articulo sostenibilidad</w:t>
+            </w:r>
+          </w:p>
+        </w:tc>
+        <w:tc>
+          <w:tcPr>
+            <w:tcW w:type="dxa" w:w="900"/>
+          </w:tcPr>
+          <w:p>
+            <w:r>
+              <w:rPr>
+                <w:sz w:val="18"/>
+                <w:szCs w:val="18"/>
+              </w:rPr>
+              <w:t xml:space="preserve">EBOOK</w:t>
+            </w:r>
+          </w:p>
+        </w:tc>
+        <w:tc>
+          <w:tcPr>
+            <w:tcW w:type="dxa" w:w="2400"/>
+          </w:tcPr>
+          <w:p>
+            <w:r>
+              <w:rPr>
+                <w:sz w:val="18"/>
+                <w:szCs w:val="18"/>
+              </w:rPr>
+              <w:t xml:space="preserve">Ebook BIM</w:t>
+            </w:r>
+          </w:p>
+        </w:tc>
+        <w:tc>
+          <w:tcPr>
+            <w:tcW w:type="dxa" w:w="2000"/>
+          </w:tcPr>
+          <w:p>
+            <w:r>
+              <w:rPr>
+                <w:sz w:val="18"/>
+                <w:szCs w:val="18"/>
+              </w:rPr>
+              <w:t xml:space="preserve">🟡 Existe; CONFIRMAR la palabra montada</w:t>
+            </w:r>
+          </w:p>
+        </w:tc>
+        <w:tc>
+          <w:tcPr>
+            <w:tcW w:type="dxa" w:w="2900"/>
+          </w:tcPr>
+          <w:p>
+            <w:r>
+              <w:rPr>
+                <w:sz w:val="18"/>
+                <w:szCs w:val="18"/>
+              </w:rPr>
+              <w:t xml:space="preserve">Enlace directo en el blog.</w:t>
+            </w:r>
+          </w:p>
+        </w:tc>
+      </w:tr>
+    </w:tbl>
     <w:p>
       <w:r>
         <w:br w:type="page"/>

</xml_diff>